<commit_message>
updated manuals formatting (cosmetics)
</commit_message>
<xml_diff>
--- a/manuals/Baccable_manual_EN.docx
+++ b/manuals/Baccable_manual_EN.docx
@@ -182,7 +182,7 @@
           <w:noProof/>
         </w:rPr>
         <w:drawing>
-          <wp:inline distT="0" distB="0" distL="0" distR="0" wp14:anchorId="67CE4B57" wp14:editId="434E9CCC">
+          <wp:inline distT="0" distB="0" distL="0" distR="0" wp14:anchorId="67CE4B57" wp14:editId="7E9280AC">
             <wp:extent cx="4912659" cy="2300605"/>
             <wp:effectExtent l="0" t="0" r="2540" b="4445"/>
             <wp:docPr id="1632200295" name="Immagine 37"/>
@@ -300,7 +300,7 @@
           <w:r>
             <w:fldChar w:fldCharType="separate"/>
           </w:r>
-          <w:hyperlink w:anchor="_Toc212741464" w:history="1">
+          <w:hyperlink w:anchor="_Toc238374741" w:history="1">
             <w:r>
               <w:rPr>
                 <w:rStyle w:val="Collegamentoipertestuale"/>
@@ -349,7 +349,7 @@
                 <w:noProof/>
                 <w:webHidden/>
               </w:rPr>
-              <w:instrText xml:space="preserve"> PAGEREF _Toc212741464 \h </w:instrText>
+              <w:instrText xml:space="preserve"> PAGEREF _Toc238374741 \h </w:instrText>
             </w:r>
             <w:r>
               <w:rPr>
@@ -394,7 +394,7 @@
               <w14:ligatures w14:val="standardContextual"/>
             </w:rPr>
           </w:pPr>
-          <w:hyperlink w:anchor="_Toc212741465" w:history="1">
+          <w:hyperlink w:anchor="_Toc238374742" w:history="1">
             <w:r>
               <w:rPr>
                 <w:rStyle w:val="Collegamentoipertestuale"/>
@@ -443,7 +443,7 @@
                 <w:noProof/>
                 <w:webHidden/>
               </w:rPr>
-              <w:instrText xml:space="preserve"> PAGEREF _Toc212741465 \h </w:instrText>
+              <w:instrText xml:space="preserve"> PAGEREF _Toc238374742 \h </w:instrText>
             </w:r>
             <w:r>
               <w:rPr>
@@ -488,7 +488,7 @@
               <w14:ligatures w14:val="standardContextual"/>
             </w:rPr>
           </w:pPr>
-          <w:hyperlink w:anchor="_Toc212741466" w:history="1">
+          <w:hyperlink w:anchor="_Toc238374743" w:history="1">
             <w:r>
               <w:rPr>
                 <w:rStyle w:val="Collegamentoipertestuale"/>
@@ -537,7 +537,7 @@
                 <w:noProof/>
                 <w:webHidden/>
               </w:rPr>
-              <w:instrText xml:space="preserve"> PAGEREF _Toc212741466 \h </w:instrText>
+              <w:instrText xml:space="preserve"> PAGEREF _Toc238374743 \h </w:instrText>
             </w:r>
             <w:r>
               <w:rPr>
@@ -582,7 +582,7 @@
               <w14:ligatures w14:val="standardContextual"/>
             </w:rPr>
           </w:pPr>
-          <w:hyperlink w:anchor="_Toc212741467" w:history="1">
+          <w:hyperlink w:anchor="_Toc238374744" w:history="1">
             <w:r>
               <w:rPr>
                 <w:rStyle w:val="Collegamentoipertestuale"/>
@@ -631,7 +631,7 @@
                 <w:noProof/>
                 <w:webHidden/>
               </w:rPr>
-              <w:instrText xml:space="preserve"> PAGEREF _Toc212741467 \h </w:instrText>
+              <w:instrText xml:space="preserve"> PAGEREF _Toc238374744 \h </w:instrText>
             </w:r>
             <w:r>
               <w:rPr>
@@ -676,7 +676,7 @@
               <w14:ligatures w14:val="standardContextual"/>
             </w:rPr>
           </w:pPr>
-          <w:hyperlink w:anchor="_Toc212741468" w:history="1">
+          <w:hyperlink w:anchor="_Toc238374745" w:history="1">
             <w:r>
               <w:rPr>
                 <w:rStyle w:val="Collegamentoipertestuale"/>
@@ -725,7 +725,7 @@
                 <w:noProof/>
                 <w:webHidden/>
               </w:rPr>
-              <w:instrText xml:space="preserve"> PAGEREF _Toc212741468 \h </w:instrText>
+              <w:instrText xml:space="preserve"> PAGEREF _Toc238374745 \h </w:instrText>
             </w:r>
             <w:r>
               <w:rPr>
@@ -770,7 +770,7 @@
               <w14:ligatures w14:val="standardContextual"/>
             </w:rPr>
           </w:pPr>
-          <w:hyperlink w:anchor="_Toc212741469" w:history="1">
+          <w:hyperlink w:anchor="_Toc238374746" w:history="1">
             <w:r>
               <w:rPr>
                 <w:rStyle w:val="Collegamentoipertestuale"/>
@@ -819,7 +819,7 @@
                 <w:noProof/>
                 <w:webHidden/>
               </w:rPr>
-              <w:instrText xml:space="preserve"> PAGEREF _Toc212741469 \h </w:instrText>
+              <w:instrText xml:space="preserve"> PAGEREF _Toc238374746 \h </w:instrText>
             </w:r>
             <w:r>
               <w:rPr>
@@ -864,7 +864,7 @@
               <w14:ligatures w14:val="standardContextual"/>
             </w:rPr>
           </w:pPr>
-          <w:hyperlink w:anchor="_Toc212741470" w:history="1">
+          <w:hyperlink w:anchor="_Toc238374747" w:history="1">
             <w:r>
               <w:rPr>
                 <w:rStyle w:val="Collegamentoipertestuale"/>
@@ -913,7 +913,7 @@
                 <w:noProof/>
                 <w:webHidden/>
               </w:rPr>
-              <w:instrText xml:space="preserve"> PAGEREF _Toc212741470 \h </w:instrText>
+              <w:instrText xml:space="preserve"> PAGEREF _Toc238374747 \h </w:instrText>
             </w:r>
             <w:r>
               <w:rPr>
@@ -958,7 +958,7 @@
               <w14:ligatures w14:val="standardContextual"/>
             </w:rPr>
           </w:pPr>
-          <w:hyperlink w:anchor="_Toc212741471" w:history="1">
+          <w:hyperlink w:anchor="_Toc238374748" w:history="1">
             <w:r>
               <w:rPr>
                 <w:rStyle w:val="Collegamentoipertestuale"/>
@@ -1007,7 +1007,7 @@
                 <w:noProof/>
                 <w:webHidden/>
               </w:rPr>
-              <w:instrText xml:space="preserve"> PAGEREF _Toc212741471 \h </w:instrText>
+              <w:instrText xml:space="preserve"> PAGEREF _Toc238374748 \h </w:instrText>
             </w:r>
             <w:r>
               <w:rPr>
@@ -1052,7 +1052,7 @@
               <w14:ligatures w14:val="standardContextual"/>
             </w:rPr>
           </w:pPr>
-          <w:hyperlink w:anchor="_Toc212741472" w:history="1">
+          <w:hyperlink w:anchor="_Toc238374749" w:history="1">
             <w:r>
               <w:rPr>
                 <w:rStyle w:val="Collegamentoipertestuale"/>
@@ -1101,7 +1101,7 @@
                 <w:noProof/>
                 <w:webHidden/>
               </w:rPr>
-              <w:instrText xml:space="preserve"> PAGEREF _Toc212741472 \h </w:instrText>
+              <w:instrText xml:space="preserve"> PAGEREF _Toc238374749 \h </w:instrText>
             </w:r>
             <w:r>
               <w:rPr>
@@ -1146,7 +1146,7 @@
               <w14:ligatures w14:val="standardContextual"/>
             </w:rPr>
           </w:pPr>
-          <w:hyperlink w:anchor="_Toc212741473" w:history="1">
+          <w:hyperlink w:anchor="_Toc238374750" w:history="1">
             <w:r>
               <w:rPr>
                 <w:rStyle w:val="Collegamentoipertestuale"/>
@@ -1195,7 +1195,7 @@
                 <w:noProof/>
                 <w:webHidden/>
               </w:rPr>
-              <w:instrText xml:space="preserve"> PAGEREF _Toc212741473 \h </w:instrText>
+              <w:instrText xml:space="preserve"> PAGEREF _Toc238374750 \h </w:instrText>
             </w:r>
             <w:r>
               <w:rPr>
@@ -1240,7 +1240,7 @@
               <w14:ligatures w14:val="standardContextual"/>
             </w:rPr>
           </w:pPr>
-          <w:hyperlink w:anchor="_Toc212741474" w:history="1">
+          <w:hyperlink w:anchor="_Toc238374751" w:history="1">
             <w:r>
               <w:rPr>
                 <w:rStyle w:val="Collegamentoipertestuale"/>
@@ -1289,7 +1289,7 @@
                 <w:noProof/>
                 <w:webHidden/>
               </w:rPr>
-              <w:instrText xml:space="preserve"> PAGEREF _Toc212741474 \h </w:instrText>
+              <w:instrText xml:space="preserve"> PAGEREF _Toc238374751 \h </w:instrText>
             </w:r>
             <w:r>
               <w:rPr>
@@ -1334,7 +1334,7 @@
               <w14:ligatures w14:val="standardContextual"/>
             </w:rPr>
           </w:pPr>
-          <w:hyperlink w:anchor="_Toc212741475" w:history="1">
+          <w:hyperlink w:anchor="_Toc238374752" w:history="1">
             <w:r>
               <w:rPr>
                 <w:rStyle w:val="Collegamentoipertestuale"/>
@@ -1383,7 +1383,7 @@
                 <w:noProof/>
                 <w:webHidden/>
               </w:rPr>
-              <w:instrText xml:space="preserve"> PAGEREF _Toc212741475 \h </w:instrText>
+              <w:instrText xml:space="preserve"> PAGEREF _Toc238374752 \h </w:instrText>
             </w:r>
             <w:r>
               <w:rPr>
@@ -1428,7 +1428,7 @@
               <w14:ligatures w14:val="standardContextual"/>
             </w:rPr>
           </w:pPr>
-          <w:hyperlink w:anchor="_Toc212741476" w:history="1">
+          <w:hyperlink w:anchor="_Toc238374753" w:history="1">
             <w:r>
               <w:rPr>
                 <w:rStyle w:val="Collegamentoipertestuale"/>
@@ -1477,7 +1477,7 @@
                 <w:noProof/>
                 <w:webHidden/>
               </w:rPr>
-              <w:instrText xml:space="preserve"> PAGEREF _Toc212741476 \h </w:instrText>
+              <w:instrText xml:space="preserve"> PAGEREF _Toc238374753 \h </w:instrText>
             </w:r>
             <w:r>
               <w:rPr>
@@ -1522,7 +1522,7 @@
               <w14:ligatures w14:val="standardContextual"/>
             </w:rPr>
           </w:pPr>
-          <w:hyperlink w:anchor="_Toc212741477" w:history="1">
+          <w:hyperlink w:anchor="_Toc238374754" w:history="1">
             <w:r>
               <w:rPr>
                 <w:rStyle w:val="Collegamentoipertestuale"/>
@@ -1571,7 +1571,7 @@
                 <w:noProof/>
                 <w:webHidden/>
               </w:rPr>
-              <w:instrText xml:space="preserve"> PAGEREF _Toc212741477 \h </w:instrText>
+              <w:instrText xml:space="preserve"> PAGEREF _Toc238374754 \h </w:instrText>
             </w:r>
             <w:r>
               <w:rPr>
@@ -1616,7 +1616,7 @@
               <w14:ligatures w14:val="standardContextual"/>
             </w:rPr>
           </w:pPr>
-          <w:hyperlink w:anchor="_Toc212741478" w:history="1">
+          <w:hyperlink w:anchor="_Toc238374755" w:history="1">
             <w:r>
               <w:rPr>
                 <w:rStyle w:val="Collegamentoipertestuale"/>
@@ -1667,7 +1667,7 @@
                 <w:noProof/>
                 <w:webHidden/>
               </w:rPr>
-              <w:instrText xml:space="preserve"> PAGEREF _Toc212741478 \h </w:instrText>
+              <w:instrText xml:space="preserve"> PAGEREF _Toc238374755 \h </w:instrText>
             </w:r>
             <w:r>
               <w:rPr>
@@ -1712,7 +1712,7 @@
               <w14:ligatures w14:val="standardContextual"/>
             </w:rPr>
           </w:pPr>
-          <w:hyperlink w:anchor="_Toc212741479" w:history="1">
+          <w:hyperlink w:anchor="_Toc238374756" w:history="1">
             <w:r>
               <w:rPr>
                 <w:rStyle w:val="Collegamentoipertestuale"/>
@@ -1761,7 +1761,7 @@
                 <w:noProof/>
                 <w:webHidden/>
               </w:rPr>
-              <w:instrText xml:space="preserve"> PAGEREF _Toc212741479 \h </w:instrText>
+              <w:instrText xml:space="preserve"> PAGEREF _Toc238374756 \h </w:instrText>
             </w:r>
             <w:r>
               <w:rPr>
@@ -1806,7 +1806,7 @@
               <w14:ligatures w14:val="standardContextual"/>
             </w:rPr>
           </w:pPr>
-          <w:hyperlink w:anchor="_Toc212741480" w:history="1">
+          <w:hyperlink w:anchor="_Toc238374757" w:history="1">
             <w:r>
               <w:rPr>
                 <w:rStyle w:val="Collegamentoipertestuale"/>
@@ -1855,7 +1855,7 @@
                 <w:noProof/>
                 <w:webHidden/>
               </w:rPr>
-              <w:instrText xml:space="preserve"> PAGEREF _Toc212741480 \h </w:instrText>
+              <w:instrText xml:space="preserve"> PAGEREF _Toc238374757 \h </w:instrText>
             </w:r>
             <w:r>
               <w:rPr>
@@ -1900,7 +1900,7 @@
               <w14:ligatures w14:val="standardContextual"/>
             </w:rPr>
           </w:pPr>
-          <w:hyperlink w:anchor="_Toc212741481" w:history="1">
+          <w:hyperlink w:anchor="_Toc238374758" w:history="1">
             <w:r>
               <w:rPr>
                 <w:rStyle w:val="Collegamentoipertestuale"/>
@@ -1949,7 +1949,7 @@
                 <w:noProof/>
                 <w:webHidden/>
               </w:rPr>
-              <w:instrText xml:space="preserve"> PAGEREF _Toc212741481 \h </w:instrText>
+              <w:instrText xml:space="preserve"> PAGEREF _Toc238374758 \h </w:instrText>
             </w:r>
             <w:r>
               <w:rPr>
@@ -1994,7 +1994,7 @@
               <w14:ligatures w14:val="standardContextual"/>
             </w:rPr>
           </w:pPr>
-          <w:hyperlink w:anchor="_Toc212741482" w:history="1">
+          <w:hyperlink w:anchor="_Toc238374759" w:history="1">
             <w:r>
               <w:rPr>
                 <w:rStyle w:val="Collegamentoipertestuale"/>
@@ -2043,7 +2043,7 @@
                 <w:noProof/>
                 <w:webHidden/>
               </w:rPr>
-              <w:instrText xml:space="preserve"> PAGEREF _Toc212741482 \h </w:instrText>
+              <w:instrText xml:space="preserve"> PAGEREF _Toc238374759 \h </w:instrText>
             </w:r>
             <w:r>
               <w:rPr>
@@ -2088,7 +2088,7 @@
               <w14:ligatures w14:val="standardContextual"/>
             </w:rPr>
           </w:pPr>
-          <w:hyperlink w:anchor="_Toc212741483" w:history="1">
+          <w:hyperlink w:anchor="_Toc238374760" w:history="1">
             <w:r>
               <w:rPr>
                 <w:rStyle w:val="Collegamentoipertestuale"/>
@@ -2137,7 +2137,7 @@
                 <w:noProof/>
                 <w:webHidden/>
               </w:rPr>
-              <w:instrText xml:space="preserve"> PAGEREF _Toc212741483 \h </w:instrText>
+              <w:instrText xml:space="preserve"> PAGEREF _Toc238374760 \h </w:instrText>
             </w:r>
             <w:r>
               <w:rPr>
@@ -2182,7 +2182,7 @@
               <w14:ligatures w14:val="standardContextual"/>
             </w:rPr>
           </w:pPr>
-          <w:hyperlink w:anchor="_Toc212741484" w:history="1">
+          <w:hyperlink w:anchor="_Toc238374761" w:history="1">
             <w:r>
               <w:rPr>
                 <w:rStyle w:val="Collegamentoipertestuale"/>
@@ -2231,7 +2231,7 @@
                 <w:noProof/>
                 <w:webHidden/>
               </w:rPr>
-              <w:instrText xml:space="preserve"> PAGEREF _Toc212741484 \h </w:instrText>
+              <w:instrText xml:space="preserve"> PAGEREF _Toc238374761 \h </w:instrText>
             </w:r>
             <w:r>
               <w:rPr>
@@ -2276,7 +2276,7 @@
               <w14:ligatures w14:val="standardContextual"/>
             </w:rPr>
           </w:pPr>
-          <w:hyperlink w:anchor="_Toc212741485" w:history="1">
+          <w:hyperlink w:anchor="_Toc238374762" w:history="1">
             <w:r>
               <w:rPr>
                 <w:rStyle w:val="Collegamentoipertestuale"/>
@@ -2325,7 +2325,7 @@
                 <w:noProof/>
                 <w:webHidden/>
               </w:rPr>
-              <w:instrText xml:space="preserve"> PAGEREF _Toc212741485 \h </w:instrText>
+              <w:instrText xml:space="preserve"> PAGEREF _Toc238374762 \h </w:instrText>
             </w:r>
             <w:r>
               <w:rPr>
@@ -2370,7 +2370,7 @@
               <w14:ligatures w14:val="standardContextual"/>
             </w:rPr>
           </w:pPr>
-          <w:hyperlink w:anchor="_Toc212741486" w:history="1">
+          <w:hyperlink w:anchor="_Toc238374763" w:history="1">
             <w:r>
               <w:rPr>
                 <w:rStyle w:val="Collegamentoipertestuale"/>
@@ -2419,7 +2419,7 @@
                 <w:noProof/>
                 <w:webHidden/>
               </w:rPr>
-              <w:instrText xml:space="preserve"> PAGEREF _Toc212741486 \h </w:instrText>
+              <w:instrText xml:space="preserve"> PAGEREF _Toc238374763 \h </w:instrText>
             </w:r>
             <w:r>
               <w:rPr>
@@ -2464,7 +2464,7 @@
               <w14:ligatures w14:val="standardContextual"/>
             </w:rPr>
           </w:pPr>
-          <w:hyperlink w:anchor="_Toc212741487" w:history="1">
+          <w:hyperlink w:anchor="_Toc238374764" w:history="1">
             <w:r>
               <w:rPr>
                 <w:rStyle w:val="Collegamentoipertestuale"/>
@@ -2513,7 +2513,7 @@
                 <w:noProof/>
                 <w:webHidden/>
               </w:rPr>
-              <w:instrText xml:space="preserve"> PAGEREF _Toc212741487 \h </w:instrText>
+              <w:instrText xml:space="preserve"> PAGEREF _Toc238374764 \h </w:instrText>
             </w:r>
             <w:r>
               <w:rPr>
@@ -2558,7 +2558,7 @@
               <w14:ligatures w14:val="standardContextual"/>
             </w:rPr>
           </w:pPr>
-          <w:hyperlink w:anchor="_Toc212741488" w:history="1">
+          <w:hyperlink w:anchor="_Toc238374765" w:history="1">
             <w:r>
               <w:rPr>
                 <w:rStyle w:val="Collegamentoipertestuale"/>
@@ -2607,7 +2607,7 @@
                 <w:noProof/>
                 <w:webHidden/>
               </w:rPr>
-              <w:instrText xml:space="preserve"> PAGEREF _Toc212741488 \h </w:instrText>
+              <w:instrText xml:space="preserve"> PAGEREF _Toc238374765 \h </w:instrText>
             </w:r>
             <w:r>
               <w:rPr>
@@ -2652,7 +2652,7 @@
               <w14:ligatures w14:val="standardContextual"/>
             </w:rPr>
           </w:pPr>
-          <w:hyperlink w:anchor="_Toc212741489" w:history="1">
+          <w:hyperlink w:anchor="_Toc238374766" w:history="1">
             <w:r>
               <w:rPr>
                 <w:rStyle w:val="Collegamentoipertestuale"/>
@@ -2701,7 +2701,7 @@
                 <w:noProof/>
                 <w:webHidden/>
               </w:rPr>
-              <w:instrText xml:space="preserve"> PAGEREF _Toc212741489 \h </w:instrText>
+              <w:instrText xml:space="preserve"> PAGEREF _Toc238374766 \h </w:instrText>
             </w:r>
             <w:r>
               <w:rPr>
@@ -2745,7 +2745,7 @@
               <w14:ligatures w14:val="standardContextual"/>
             </w:rPr>
           </w:pPr>
-          <w:hyperlink w:anchor="_Toc212741490" w:history="1">
+          <w:hyperlink w:anchor="_Toc238374767" w:history="1">
             <w:r>
               <w:rPr>
                 <w:rStyle w:val="Collegamentoipertestuale"/>
@@ -2775,7 +2775,7 @@
                 <w:noProof/>
                 <w:webHidden/>
               </w:rPr>
-              <w:instrText xml:space="preserve"> PAGEREF _Toc212741490 \h </w:instrText>
+              <w:instrText xml:space="preserve"> PAGEREF _Toc238374767 \h </w:instrText>
             </w:r>
             <w:r>
               <w:rPr>
@@ -2819,7 +2819,7 @@
               <w14:ligatures w14:val="standardContextual"/>
             </w:rPr>
           </w:pPr>
-          <w:hyperlink w:anchor="_Toc212741491" w:history="1">
+          <w:hyperlink w:anchor="_Toc238374768" w:history="1">
             <w:r>
               <w:rPr>
                 <w:rStyle w:val="Collegamentoipertestuale"/>
@@ -2849,7 +2849,7 @@
                 <w:noProof/>
                 <w:webHidden/>
               </w:rPr>
-              <w:instrText xml:space="preserve"> PAGEREF _Toc212741491 \h </w:instrText>
+              <w:instrText xml:space="preserve"> PAGEREF _Toc238374768 \h </w:instrText>
             </w:r>
             <w:r>
               <w:rPr>
@@ -2893,7 +2893,7 @@
               <w14:ligatures w14:val="standardContextual"/>
             </w:rPr>
           </w:pPr>
-          <w:hyperlink w:anchor="_Toc212741492" w:history="1">
+          <w:hyperlink w:anchor="_Toc238374769" w:history="1">
             <w:r>
               <w:rPr>
                 <w:rStyle w:val="Collegamentoipertestuale"/>
@@ -2923,7 +2923,7 @@
                 <w:noProof/>
                 <w:webHidden/>
               </w:rPr>
-              <w:instrText xml:space="preserve"> PAGEREF _Toc212741492 \h </w:instrText>
+              <w:instrText xml:space="preserve"> PAGEREF _Toc238374769 \h </w:instrText>
             </w:r>
             <w:r>
               <w:rPr>
@@ -2968,7 +2968,7 @@
               <w14:ligatures w14:val="standardContextual"/>
             </w:rPr>
           </w:pPr>
-          <w:hyperlink w:anchor="_Toc212741493" w:history="1">
+          <w:hyperlink w:anchor="_Toc238374770" w:history="1">
             <w:r>
               <w:rPr>
                 <w:rStyle w:val="Collegamentoipertestuale"/>
@@ -3017,7 +3017,7 @@
                 <w:noProof/>
                 <w:webHidden/>
               </w:rPr>
-              <w:instrText xml:space="preserve"> PAGEREF _Toc212741493 \h </w:instrText>
+              <w:instrText xml:space="preserve"> PAGEREF _Toc238374770 \h </w:instrText>
             </w:r>
             <w:r>
               <w:rPr>
@@ -3062,7 +3062,7 @@
               <w14:ligatures w14:val="standardContextual"/>
             </w:rPr>
           </w:pPr>
-          <w:hyperlink w:anchor="_Toc212741494" w:history="1">
+          <w:hyperlink w:anchor="_Toc238374771" w:history="1">
             <w:r>
               <w:rPr>
                 <w:rStyle w:val="Collegamentoipertestuale"/>
@@ -3111,7 +3111,7 @@
                 <w:noProof/>
                 <w:webHidden/>
               </w:rPr>
-              <w:instrText xml:space="preserve"> PAGEREF _Toc212741494 \h </w:instrText>
+              <w:instrText xml:space="preserve"> PAGEREF _Toc238374771 \h </w:instrText>
             </w:r>
             <w:r>
               <w:rPr>
@@ -3156,7 +3156,7 @@
               <w14:ligatures w14:val="standardContextual"/>
             </w:rPr>
           </w:pPr>
-          <w:hyperlink w:anchor="_Toc212741495" w:history="1">
+          <w:hyperlink w:anchor="_Toc238374772" w:history="1">
             <w:r>
               <w:rPr>
                 <w:rStyle w:val="Collegamentoipertestuale"/>
@@ -3165,7 +3165,7 @@
                 <w:bCs/>
                 <w:noProof/>
               </w:rPr>
-              <w:t>2.16.1</w:t>
+              <w:t>2.16.2</w:t>
             </w:r>
             <w:r>
               <w:rPr>
@@ -3205,7 +3205,7 @@
                 <w:noProof/>
                 <w:webHidden/>
               </w:rPr>
-              <w:instrText xml:space="preserve"> PAGEREF _Toc212741495 \h </w:instrText>
+              <w:instrText xml:space="preserve"> PAGEREF _Toc238374772 \h </w:instrText>
             </w:r>
             <w:r>
               <w:rPr>
@@ -3250,7 +3250,7 @@
               <w14:ligatures w14:val="standardContextual"/>
             </w:rPr>
           </w:pPr>
-          <w:hyperlink w:anchor="_Toc212741496" w:history="1">
+          <w:hyperlink w:anchor="_Toc238374773" w:history="1">
             <w:r>
               <w:rPr>
                 <w:rStyle w:val="Collegamentoipertestuale"/>
@@ -3299,7 +3299,7 @@
                 <w:noProof/>
                 <w:webHidden/>
               </w:rPr>
-              <w:instrText xml:space="preserve"> PAGEREF _Toc212741496 \h </w:instrText>
+              <w:instrText xml:space="preserve"> PAGEREF _Toc238374773 \h </w:instrText>
             </w:r>
             <w:r>
               <w:rPr>
@@ -3344,7 +3344,7 @@
               <w14:ligatures w14:val="standardContextual"/>
             </w:rPr>
           </w:pPr>
-          <w:hyperlink w:anchor="_Toc212741497" w:history="1">
+          <w:hyperlink w:anchor="_Toc238374774" w:history="1">
             <w:r>
               <w:rPr>
                 <w:rStyle w:val="Collegamentoipertestuale"/>
@@ -3393,7 +3393,7 @@
                 <w:noProof/>
                 <w:webHidden/>
               </w:rPr>
-              <w:instrText xml:space="preserve"> PAGEREF _Toc212741497 \h </w:instrText>
+              <w:instrText xml:space="preserve"> PAGEREF _Toc238374774 \h </w:instrText>
             </w:r>
             <w:r>
               <w:rPr>
@@ -3438,7 +3438,7 @@
               <w14:ligatures w14:val="standardContextual"/>
             </w:rPr>
           </w:pPr>
-          <w:hyperlink w:anchor="_Toc212741498" w:history="1">
+          <w:hyperlink w:anchor="_Toc238374775" w:history="1">
             <w:r>
               <w:rPr>
                 <w:rStyle w:val="Collegamentoipertestuale"/>
@@ -3487,7 +3487,7 @@
                 <w:noProof/>
                 <w:webHidden/>
               </w:rPr>
-              <w:instrText xml:space="preserve"> PAGEREF _Toc212741498 \h </w:instrText>
+              <w:instrText xml:space="preserve"> PAGEREF _Toc238374775 \h </w:instrText>
             </w:r>
             <w:r>
               <w:rPr>
@@ -3532,7 +3532,7 @@
               <w14:ligatures w14:val="standardContextual"/>
             </w:rPr>
           </w:pPr>
-          <w:hyperlink w:anchor="_Toc212741499" w:history="1">
+          <w:hyperlink w:anchor="_Toc238374776" w:history="1">
             <w:r>
               <w:rPr>
                 <w:rStyle w:val="Collegamentoipertestuale"/>
@@ -3581,7 +3581,7 @@
                 <w:noProof/>
                 <w:webHidden/>
               </w:rPr>
-              <w:instrText xml:space="preserve"> PAGEREF _Toc212741499 \h </w:instrText>
+              <w:instrText xml:space="preserve"> PAGEREF _Toc238374776 \h </w:instrText>
             </w:r>
             <w:r>
               <w:rPr>
@@ -3626,7 +3626,7 @@
               <w14:ligatures w14:val="standardContextual"/>
             </w:rPr>
           </w:pPr>
-          <w:hyperlink w:anchor="_Toc212741500" w:history="1">
+          <w:hyperlink w:anchor="_Toc238374777" w:history="1">
             <w:r>
               <w:rPr>
                 <w:rStyle w:val="Collegamentoipertestuale"/>
@@ -3675,7 +3675,7 @@
                 <w:noProof/>
                 <w:webHidden/>
               </w:rPr>
-              <w:instrText xml:space="preserve"> PAGEREF _Toc212741500 \h </w:instrText>
+              <w:instrText xml:space="preserve"> PAGEREF _Toc238374777 \h </w:instrText>
             </w:r>
             <w:r>
               <w:rPr>
@@ -3720,7 +3720,7 @@
               <w14:ligatures w14:val="standardContextual"/>
             </w:rPr>
           </w:pPr>
-          <w:hyperlink w:anchor="_Toc212741501" w:history="1">
+          <w:hyperlink w:anchor="_Toc238374778" w:history="1">
             <w:r>
               <w:rPr>
                 <w:rStyle w:val="Collegamentoipertestuale"/>
@@ -3769,7 +3769,7 @@
                 <w:noProof/>
                 <w:webHidden/>
               </w:rPr>
-              <w:instrText xml:space="preserve"> PAGEREF _Toc212741501 \h </w:instrText>
+              <w:instrText xml:space="preserve"> PAGEREF _Toc238374778 \h </w:instrText>
             </w:r>
             <w:r>
               <w:rPr>
@@ -3814,7 +3814,7 @@
               <w14:ligatures w14:val="standardContextual"/>
             </w:rPr>
           </w:pPr>
-          <w:hyperlink w:anchor="_Toc212741502" w:history="1">
+          <w:hyperlink w:anchor="_Toc238374779" w:history="1">
             <w:r>
               <w:rPr>
                 <w:rStyle w:val="Collegamentoipertestuale"/>
@@ -3863,7 +3863,7 @@
                 <w:noProof/>
                 <w:webHidden/>
               </w:rPr>
-              <w:instrText xml:space="preserve"> PAGEREF _Toc212741502 \h </w:instrText>
+              <w:instrText xml:space="preserve"> PAGEREF _Toc238374779 \h </w:instrText>
             </w:r>
             <w:r>
               <w:rPr>
@@ -3908,7 +3908,7 @@
               <w14:ligatures w14:val="standardContextual"/>
             </w:rPr>
           </w:pPr>
-          <w:hyperlink w:anchor="_Toc212741503" w:history="1">
+          <w:hyperlink w:anchor="_Toc238374780" w:history="1">
             <w:r>
               <w:rPr>
                 <w:rStyle w:val="Collegamentoipertestuale"/>
@@ -3957,7 +3957,7 @@
                 <w:noProof/>
                 <w:webHidden/>
               </w:rPr>
-              <w:instrText xml:space="preserve"> PAGEREF _Toc212741503 \h </w:instrText>
+              <w:instrText xml:space="preserve"> PAGEREF _Toc238374780 \h </w:instrText>
             </w:r>
             <w:r>
               <w:rPr>
@@ -4002,7 +4002,7 @@
               <w14:ligatures w14:val="standardContextual"/>
             </w:rPr>
           </w:pPr>
-          <w:hyperlink w:anchor="_Toc212741504" w:history="1">
+          <w:hyperlink w:anchor="_Toc238374781" w:history="1">
             <w:r>
               <w:rPr>
                 <w:rStyle w:val="Collegamentoipertestuale"/>
@@ -4051,7 +4051,7 @@
                 <w:noProof/>
                 <w:webHidden/>
               </w:rPr>
-              <w:instrText xml:space="preserve"> PAGEREF _Toc212741504 \h </w:instrText>
+              <w:instrText xml:space="preserve"> PAGEREF _Toc238374781 \h </w:instrText>
             </w:r>
             <w:r>
               <w:rPr>
@@ -4096,7 +4096,7 @@
               <w14:ligatures w14:val="standardContextual"/>
             </w:rPr>
           </w:pPr>
-          <w:hyperlink w:anchor="_Toc212741505" w:history="1">
+          <w:hyperlink w:anchor="_Toc238374782" w:history="1">
             <w:r>
               <w:rPr>
                 <w:rStyle w:val="Collegamentoipertestuale"/>
@@ -4145,7 +4145,7 @@
                 <w:noProof/>
                 <w:webHidden/>
               </w:rPr>
-              <w:instrText xml:space="preserve"> PAGEREF _Toc212741505 \h </w:instrText>
+              <w:instrText xml:space="preserve"> PAGEREF _Toc238374782 \h </w:instrText>
             </w:r>
             <w:r>
               <w:rPr>
@@ -4190,7 +4190,7 @@
               <w14:ligatures w14:val="standardContextual"/>
             </w:rPr>
           </w:pPr>
-          <w:hyperlink w:anchor="_Toc212741506" w:history="1">
+          <w:hyperlink w:anchor="_Toc238374783" w:history="1">
             <w:r>
               <w:rPr>
                 <w:rStyle w:val="Collegamentoipertestuale"/>
@@ -4239,7 +4239,7 @@
                 <w:noProof/>
                 <w:webHidden/>
               </w:rPr>
-              <w:instrText xml:space="preserve"> PAGEREF _Toc212741506 \h </w:instrText>
+              <w:instrText xml:space="preserve"> PAGEREF _Toc238374783 \h </w:instrText>
             </w:r>
             <w:r>
               <w:rPr>
@@ -4284,7 +4284,7 @@
               <w14:ligatures w14:val="standardContextual"/>
             </w:rPr>
           </w:pPr>
-          <w:hyperlink w:anchor="_Toc212741507" w:history="1">
+          <w:hyperlink w:anchor="_Toc238374784" w:history="1">
             <w:r>
               <w:rPr>
                 <w:rStyle w:val="Collegamentoipertestuale"/>
@@ -4333,7 +4333,7 @@
                 <w:noProof/>
                 <w:webHidden/>
               </w:rPr>
-              <w:instrText xml:space="preserve"> PAGEREF _Toc212741507 \h </w:instrText>
+              <w:instrText xml:space="preserve"> PAGEREF _Toc238374784 \h </w:instrText>
             </w:r>
             <w:r>
               <w:rPr>
@@ -4378,7 +4378,7 @@
               <w14:ligatures w14:val="standardContextual"/>
             </w:rPr>
           </w:pPr>
-          <w:hyperlink w:anchor="_Toc212741508" w:history="1">
+          <w:hyperlink w:anchor="_Toc238374785" w:history="1">
             <w:r>
               <w:rPr>
                 <w:rStyle w:val="Collegamentoipertestuale"/>
@@ -4427,7 +4427,7 @@
                 <w:noProof/>
                 <w:webHidden/>
               </w:rPr>
-              <w:instrText xml:space="preserve"> PAGEREF _Toc212741508 \h </w:instrText>
+              <w:instrText xml:space="preserve"> PAGEREF _Toc238374785 \h </w:instrText>
             </w:r>
             <w:r>
               <w:rPr>
@@ -4472,7 +4472,7 @@
               <w14:ligatures w14:val="standardContextual"/>
             </w:rPr>
           </w:pPr>
-          <w:hyperlink w:anchor="_Toc212741509" w:history="1">
+          <w:hyperlink w:anchor="_Toc238374786" w:history="1">
             <w:r>
               <w:rPr>
                 <w:rStyle w:val="Collegamentoipertestuale"/>
@@ -4521,7 +4521,7 @@
                 <w:noProof/>
                 <w:webHidden/>
               </w:rPr>
-              <w:instrText xml:space="preserve"> PAGEREF _Toc212741509 \h </w:instrText>
+              <w:instrText xml:space="preserve"> PAGEREF _Toc238374786 \h </w:instrText>
             </w:r>
             <w:r>
               <w:rPr>
@@ -4607,7 +4607,7 @@
           <w:color w:val="auto"/>
         </w:rPr>
       </w:pPr>
-      <w:bookmarkStart w:id="0" w:name="_Toc212741464"/>
+      <w:bookmarkStart w:id="0" w:name="_Toc238374741"/>
       <w:r>
         <w:rPr>
           <w:rStyle w:val="Enfasigrassetto"/>
@@ -4629,7 +4629,7 @@
           <w:color w:val="auto"/>
         </w:rPr>
       </w:pPr>
-      <w:bookmarkStart w:id="1" w:name="_Toc212741465"/>
+      <w:bookmarkStart w:id="1" w:name="_Toc238374742"/>
       <w:r>
         <w:rPr>
           <w:rStyle w:val="Enfasigrassetto"/>
@@ -4666,7 +4666,7 @@
           <w:noProof/>
         </w:rPr>
         <w:drawing>
-          <wp:inline distT="0" distB="0" distL="0" distR="0" wp14:anchorId="609577F7" wp14:editId="5DCAACA8">
+          <wp:inline distT="0" distB="0" distL="0" distR="0" wp14:anchorId="609577F7" wp14:editId="4B57B39E">
             <wp:extent cx="2583211" cy="2313745"/>
             <wp:effectExtent l="0" t="0" r="7620" b="0"/>
             <wp:docPr id="781633535" name="Immagine 39"/>
@@ -4722,7 +4722,7 @@
           <w:noProof/>
         </w:rPr>
         <w:drawing>
-          <wp:inline distT="0" distB="0" distL="0" distR="0" wp14:anchorId="61281DE3" wp14:editId="4AE567C4">
+          <wp:inline distT="0" distB="0" distL="0" distR="0" wp14:anchorId="61281DE3" wp14:editId="5EBE733C">
             <wp:extent cx="2411730" cy="2314135"/>
             <wp:effectExtent l="0" t="0" r="7620" b="0"/>
             <wp:docPr id="1618152605" name="Immagine 38"/>
@@ -4837,7 +4837,7 @@
           <w:color w:val="auto"/>
         </w:rPr>
       </w:pPr>
-      <w:bookmarkStart w:id="2" w:name="_Toc212741466"/>
+      <w:bookmarkStart w:id="2" w:name="_Toc238374743"/>
       <w:r>
         <w:rPr>
           <w:rStyle w:val="Enfasigrassetto"/>
@@ -5031,7 +5031,7 @@
           <w:color w:val="auto"/>
         </w:rPr>
       </w:pPr>
-      <w:bookmarkStart w:id="3" w:name="_Toc212741467"/>
+      <w:bookmarkStart w:id="3" w:name="_Toc238374744"/>
       <w:r>
         <w:rPr>
           <w:rStyle w:val="Enfasigrassetto"/>
@@ -5372,7 +5372,7 @@
           <w:noProof/>
         </w:rPr>
         <w:drawing>
-          <wp:inline distT="0" distB="0" distL="0" distR="0" wp14:anchorId="22162EBD" wp14:editId="15C53DED">
+          <wp:inline distT="0" distB="0" distL="0" distR="0" wp14:anchorId="22162EBD" wp14:editId="19E419CC">
             <wp:extent cx="2700997" cy="2488565"/>
             <wp:effectExtent l="0" t="0" r="4445" b="6985"/>
             <wp:docPr id="133927039" name="Immagine 37"/>
@@ -5698,7 +5698,7 @@
           <w:color w:val="auto"/>
         </w:rPr>
       </w:pPr>
-      <w:bookmarkStart w:id="4" w:name="_Toc212741468"/>
+      <w:bookmarkStart w:id="4" w:name="_Toc238374745"/>
       <w:r>
         <w:rPr>
           <w:rStyle w:val="Enfasigrassetto"/>
@@ -5804,15 +5804,7 @@
         <w:jc w:val="both"/>
       </w:pPr>
       <w:r>
-        <w:t xml:space="preserve">The quick connector </w:t>
-      </w:r>
-      <w:proofErr w:type="gramStart"/>
-      <w:r>
-        <w:t>is capable of crimping</w:t>
-      </w:r>
-      <w:proofErr w:type="gramEnd"/>
-      <w:r>
-        <w:t xml:space="preserve"> a wide range of wire sizes; however, this versatility makes the </w:t>
+        <w:t xml:space="preserve">The quick connector is capable of crimping a wide range of wire sizes; however, this versatility makes the </w:t>
       </w:r>
       <w:r>
         <w:t xml:space="preserve">dual quick </w:t>
@@ -5933,7 +5925,7 @@
           <w:color w:val="auto"/>
         </w:rPr>
       </w:pPr>
-      <w:bookmarkStart w:id="5" w:name="_Toc212741469"/>
+      <w:bookmarkStart w:id="5" w:name="_Toc238374746"/>
       <w:r>
         <w:rPr>
           <w:rStyle w:val="Enfasigrassetto"/>
@@ -6036,7 +6028,7 @@
           <w:color w:val="auto"/>
         </w:rPr>
       </w:pPr>
-      <w:bookmarkStart w:id="6" w:name="_Toc212741470"/>
+      <w:bookmarkStart w:id="6" w:name="_Toc238374747"/>
       <w:r>
         <w:rPr>
           <w:rStyle w:val="Enfasigrassetto"/>
@@ -6100,7 +6092,7 @@
           <w:color w:val="auto"/>
         </w:rPr>
       </w:pPr>
-      <w:bookmarkStart w:id="7" w:name="_Toc212741471"/>
+      <w:bookmarkStart w:id="7" w:name="_Toc238374748"/>
       <w:r>
         <w:rPr>
           <w:rStyle w:val="Enfasigrassetto"/>
@@ -6403,7 +6395,7 @@
           <w:color w:val="auto"/>
         </w:rPr>
       </w:pPr>
-      <w:bookmarkStart w:id="8" w:name="_Toc212741472"/>
+      <w:bookmarkStart w:id="8" w:name="_Toc238374749"/>
       <w:r>
         <w:rPr>
           <w:rStyle w:val="Enfasigrassetto"/>
@@ -6471,7 +6463,7 @@
           <w:color w:val="auto"/>
         </w:rPr>
       </w:pPr>
-      <w:bookmarkStart w:id="9" w:name="_Toc212741473"/>
+      <w:bookmarkStart w:id="9" w:name="_Toc238374750"/>
       <w:r>
         <w:rPr>
           <w:rStyle w:val="Enfasigrassetto"/>
@@ -6964,7 +6956,7 @@
           <w:noProof/>
         </w:rPr>
         <w:drawing>
-          <wp:inline distT="0" distB="0" distL="0" distR="0" wp14:anchorId="0DF2352D" wp14:editId="0EE8D878">
+          <wp:inline distT="0" distB="0" distL="0" distR="0" wp14:anchorId="0DF2352D" wp14:editId="316C1165">
             <wp:extent cx="4812030" cy="4904114"/>
             <wp:effectExtent l="0" t="0" r="7620" b="0"/>
             <wp:docPr id="871947284" name="Immagine 1"/>
@@ -7228,7 +7220,7 @@
         </w:rPr>
       </w:pPr>
       <w:bookmarkStart w:id="10" w:name="_Toc196905527"/>
-      <w:bookmarkStart w:id="11" w:name="_Toc212741474"/>
+      <w:bookmarkStart w:id="11" w:name="_Toc238374751"/>
       <w:r>
         <w:rPr>
           <w:rStyle w:val="Enfasigrassetto"/>
@@ -7346,7 +7338,7 @@
           <w:color w:val="auto"/>
         </w:rPr>
       </w:pPr>
-      <w:bookmarkStart w:id="12" w:name="_Toc212741475"/>
+      <w:bookmarkStart w:id="12" w:name="_Toc238374752"/>
       <w:r>
         <w:rPr>
           <w:rStyle w:val="Enfasigrassetto"/>
@@ -7791,7 +7783,7 @@
           <w:noProof/>
         </w:rPr>
         <w:drawing>
-          <wp:inline distT="0" distB="0" distL="0" distR="0" wp14:anchorId="14B2A6D3" wp14:editId="54CE7199">
+          <wp:inline distT="0" distB="0" distL="0" distR="0" wp14:anchorId="14B2A6D3" wp14:editId="1A57B29E">
             <wp:extent cx="2700997" cy="2488565"/>
             <wp:effectExtent l="0" t="0" r="4445" b="6985"/>
             <wp:docPr id="317039099" name="Immagine 37"/>
@@ -8079,7 +8071,7 @@
           <w:color w:val="auto"/>
         </w:rPr>
       </w:pPr>
-      <w:bookmarkStart w:id="13" w:name="_Toc212741476"/>
+      <w:bookmarkStart w:id="13" w:name="_Toc238374753"/>
       <w:r>
         <w:rPr>
           <w:rStyle w:val="Enfasigrassetto"/>
@@ -8749,15 +8741,7 @@
         </w:rPr>
       </w:pPr>
       <w:r>
-        <w:t>If, upon pressing the CONNECT button, the error “device is under read out protection” appears—as shown in the figure below—</w:t>
-      </w:r>
-      <w:proofErr w:type="gramStart"/>
-      <w:r>
-        <w:t>it’s</w:t>
-      </w:r>
-      <w:proofErr w:type="gramEnd"/>
-      <w:r>
-        <w:t xml:space="preserve"> likely due to an incompatibility between the USB port chipset of the PC and the chip used in the </w:t>
+        <w:t xml:space="preserve">If, upon pressing the CONNECT button, the error “device is under read out protection” appears—as shown in the figure below—it’s likely due to an incompatibility between the USB port chipset of the PC and the chip used in the </w:t>
       </w:r>
       <w:proofErr w:type="spellStart"/>
       <w:r>
@@ -9583,8 +9567,8 @@
       </w:pPr>
       <w:bookmarkStart w:id="14" w:name="_Toc205197644"/>
       <w:bookmarkStart w:id="15" w:name="_Toc205197645"/>
-      <w:bookmarkStart w:id="16" w:name="_Toc212741477"/>
-      <w:bookmarkStart w:id="17" w:name="_Hlk194154488"/>
+      <w:bookmarkStart w:id="16" w:name="_Hlk194154488"/>
+      <w:bookmarkStart w:id="17" w:name="_Toc238374754"/>
       <w:bookmarkEnd w:id="14"/>
       <w:bookmarkEnd w:id="15"/>
       <w:r>
@@ -9596,7 +9580,7 @@
         <w:lastRenderedPageBreak/>
         <w:t>USAGE</w:t>
       </w:r>
-      <w:bookmarkEnd w:id="16"/>
+      <w:bookmarkEnd w:id="17"/>
     </w:p>
     <w:p/>
     <w:p>
@@ -9610,7 +9594,7 @@
         </w:rPr>
       </w:pPr>
       <w:bookmarkStart w:id="18" w:name="_Toc196901128"/>
-      <w:bookmarkStart w:id="19" w:name="_Toc212741478"/>
+      <w:bookmarkStart w:id="19" w:name="_Toc238374755"/>
       <w:r>
         <w:rPr>
           <w:rStyle w:val="Enfasigrassetto"/>
@@ -9937,7 +9921,7 @@
           <w:color w:val="auto"/>
         </w:rPr>
       </w:pPr>
-      <w:bookmarkStart w:id="20" w:name="_Toc212741479"/>
+      <w:bookmarkStart w:id="20" w:name="_Toc238374756"/>
       <w:r>
         <w:rPr>
           <w:rStyle w:val="Enfasigrassetto"/>
@@ -10117,15 +10101,7 @@
         <w:jc w:val="both"/>
       </w:pPr>
       <w:r>
-        <w:t>From top menu “Connection</w:t>
-      </w:r>
-      <w:proofErr w:type="gramStart"/>
-      <w:r>
-        <w:t>”,</w:t>
-      </w:r>
-      <w:proofErr w:type="gramEnd"/>
-      <w:r>
-        <w:t xml:space="preserve"> select “Open Connection Window”</w:t>
+        <w:t>From top menu “Connection”, select “Open Connection Window”</w:t>
       </w:r>
     </w:p>
     <w:p>
@@ -10397,7 +10373,7 @@
           <w:color w:val="auto"/>
         </w:rPr>
       </w:pPr>
-      <w:bookmarkStart w:id="21" w:name="_Toc212741480"/>
+      <w:bookmarkStart w:id="21" w:name="_Toc238374757"/>
       <w:r>
         <w:rPr>
           <w:rStyle w:val="Enfasigrassetto"/>
@@ -10515,7 +10491,7 @@
           <w:color w:val="auto"/>
         </w:rPr>
       </w:pPr>
-      <w:bookmarkStart w:id="22" w:name="_Toc212741481"/>
+      <w:bookmarkStart w:id="22" w:name="_Toc238374758"/>
       <w:r>
         <w:rPr>
           <w:rStyle w:val="Enfasigrassetto"/>
@@ -10641,15 +10617,7 @@
         <w:jc w:val="both"/>
       </w:pPr>
       <w:r>
-        <w:t xml:space="preserve">Continuously Resets the RFHUB </w:t>
-      </w:r>
-      <w:proofErr w:type="gramStart"/>
-      <w:r>
-        <w:t>in order to</w:t>
-      </w:r>
-      <w:proofErr w:type="gramEnd"/>
-      <w:r>
-        <w:t xml:space="preserve"> reset the thief connection, with this message for 10 seconds</w:t>
+        <w:t>Continuously Resets the RFHUB in order to reset the thief connection, with this message for 10 seconds</w:t>
       </w:r>
     </w:p>
     <w:p>
@@ -10805,15 +10773,7 @@
         <w:t xml:space="preserve"> </w:t>
       </w:r>
       <w:r>
-        <w:t xml:space="preserve">The </w:t>
-      </w:r>
-      <w:proofErr w:type="gramStart"/>
-      <w:r>
-        <w:t>current status</w:t>
-      </w:r>
-      <w:proofErr w:type="gramEnd"/>
-      <w:r>
-        <w:t xml:space="preserve"> of the Immobilizer is also displayed in the main menu of the BACCABLE with the text “IMMOBILIZER ON” or “IMMOBILIZER OFF”.</w:t>
+        <w:t>The current status of the Immobilizer is also displayed in the main menu of the BACCABLE with the text “IMMOBILIZER ON” or “IMMOBILIZER OFF”.</w:t>
       </w:r>
     </w:p>
     <w:p>
@@ -10908,7 +10868,7 @@
           <w:color w:val="auto"/>
         </w:rPr>
       </w:pPr>
-      <w:bookmarkStart w:id="23" w:name="_Toc212741482"/>
+      <w:bookmarkStart w:id="23" w:name="_Toc238374759"/>
       <w:r>
         <w:rPr>
           <w:rStyle w:val="Enfasigrassetto"/>
@@ -11112,15 +11072,7 @@
       </w:r>
       <w:proofErr w:type="spellEnd"/>
       <w:r>
-        <w:t xml:space="preserve"> when the car goes to sleep </w:t>
-      </w:r>
-      <w:proofErr w:type="gramStart"/>
-      <w:r>
-        <w:t>in order to</w:t>
-      </w:r>
-      <w:proofErr w:type="gramEnd"/>
-      <w:r>
-        <w:t xml:space="preserve"> avoid battery drain.</w:t>
+        <w:t xml:space="preserve"> when the car goes to sleep in order to avoid battery drain.</w:t>
       </w:r>
       <w:r>
         <w:t xml:space="preserve"> The number of </w:t>
@@ -11320,7 +11272,7 @@
           <w:color w:val="auto"/>
         </w:rPr>
       </w:pPr>
-      <w:bookmarkStart w:id="24" w:name="_Toc212741483"/>
+      <w:bookmarkStart w:id="24" w:name="_Toc238374760"/>
       <w:r>
         <w:rPr>
           <w:rStyle w:val="Enfasigrassetto"/>
@@ -11486,7 +11438,7 @@
           <w:color w:val="auto"/>
         </w:rPr>
       </w:pPr>
-      <w:bookmarkStart w:id="25" w:name="_Toc212741484"/>
+      <w:bookmarkStart w:id="25" w:name="_Toc238374761"/>
       <w:r>
         <w:rPr>
           <w:rStyle w:val="Enfasigrassetto"/>
@@ -11563,7 +11515,7 @@
           <w:color w:val="auto"/>
         </w:rPr>
       </w:pPr>
-      <w:bookmarkStart w:id="26" w:name="_Toc212741485"/>
+      <w:bookmarkStart w:id="26" w:name="_Toc238374762"/>
       <w:r>
         <w:rPr>
           <w:rStyle w:val="Enfasigrassetto"/>
@@ -22270,7 +22222,7 @@
           <w:color w:val="auto"/>
         </w:rPr>
       </w:pPr>
-      <w:bookmarkStart w:id="27" w:name="_Toc212741486"/>
+      <w:bookmarkStart w:id="27" w:name="_Toc238374763"/>
       <w:r>
         <w:rPr>
           <w:rStyle w:val="Enfasigrassetto"/>
@@ -22378,15 +22330,7 @@
       </w:r>
       <w:proofErr w:type="spellEnd"/>
       <w:r>
-        <w:t xml:space="preserve"> parameter response, </w:t>
-      </w:r>
-      <w:proofErr w:type="gramStart"/>
-      <w:r>
-        <w:t>in order to</w:t>
-      </w:r>
-      <w:proofErr w:type="gramEnd"/>
-      <w:r>
-        <w:t xml:space="preserve"> make them available to diagnostic requests performed with OBD (you can get parameters commonly not available in OBD apps). This functionality performs the following: Upon receive of UDS request with message id 0x18DABAF1 having message data 0622xzyyyyyyyy, </w:t>
+        <w:t xml:space="preserve"> parameter response, in order to make them available to diagnostic requests performed with OBD (you can get parameters commonly not available in OBD apps). This functionality performs the following: Upon receive of UDS request with message id 0x18DABAF1 having message data 0622xzyyyyyyyy, </w:t>
       </w:r>
       <w:proofErr w:type="spellStart"/>
       <w:r>
@@ -22684,7 +22628,7 @@
           <w:color w:val="auto"/>
         </w:rPr>
       </w:pPr>
-      <w:bookmarkStart w:id="29" w:name="_Toc212741487"/>
+      <w:bookmarkStart w:id="29" w:name="_Toc238374764"/>
       <w:r>
         <w:rPr>
           <w:rStyle w:val="Enfasigrassetto"/>
@@ -22840,7 +22784,7 @@
           <w:color w:val="auto"/>
         </w:rPr>
       </w:pPr>
-      <w:bookmarkStart w:id="30" w:name="_Toc212741488"/>
+      <w:bookmarkStart w:id="30" w:name="_Toc238374765"/>
       <w:r>
         <w:rPr>
           <w:rStyle w:val="Enfasigrassetto"/>
@@ -23100,7 +23044,7 @@
           <w:color w:val="auto"/>
         </w:rPr>
       </w:pPr>
-      <w:bookmarkStart w:id="31" w:name="_Toc212741489"/>
+      <w:bookmarkStart w:id="31" w:name="_Toc238374766"/>
       <w:r>
         <w:rPr>
           <w:rStyle w:val="Enfasigrassetto"/>
@@ -23172,7 +23116,7 @@
         <w:t xml:space="preserve"> the button presses on the Cruise Control keypad, replacing them with those of the Adaptive Cruise Control (ACC) keypad. This eliminates the need to purchase the ACC keypad on the steering wheel. It is dependent on performing a proxy alignment to enable ACC and disable CC</w:t>
       </w:r>
     </w:p>
-    <w:bookmarkEnd w:id="17"/>
+    <w:bookmarkEnd w:id="16"/>
     <w:p>
       <w:pPr>
         <w:jc w:val="both"/>
@@ -23248,7 +23192,7 @@
           <w:color w:val="auto"/>
         </w:rPr>
       </w:pPr>
-      <w:bookmarkStart w:id="32" w:name="_Toc212741490"/>
+      <w:bookmarkStart w:id="32" w:name="_Toc238374767"/>
       <w:proofErr w:type="gramStart"/>
       <w:r>
         <w:rPr>
@@ -23330,7 +23274,7 @@
           <w:color w:val="auto"/>
         </w:rPr>
       </w:pPr>
-      <w:bookmarkStart w:id="33" w:name="_Toc212741491"/>
+      <w:bookmarkStart w:id="33" w:name="_Toc238374768"/>
       <w:proofErr w:type="gramStart"/>
       <w:r>
         <w:rPr>
@@ -23394,7 +23338,7 @@
           <w:color w:val="auto"/>
         </w:rPr>
       </w:pPr>
-      <w:bookmarkStart w:id="34" w:name="_Toc212741492"/>
+      <w:bookmarkStart w:id="34" w:name="_Toc238374769"/>
       <w:proofErr w:type="gramStart"/>
       <w:r>
         <w:rPr>
@@ -23487,7 +23431,7 @@
           <w:color w:val="auto"/>
         </w:rPr>
       </w:pPr>
-      <w:bookmarkStart w:id="35" w:name="_Toc212741493"/>
+      <w:bookmarkStart w:id="35" w:name="_Toc238374770"/>
       <w:r>
         <w:rPr>
           <w:rStyle w:val="Enfasigrassetto"/>
@@ -23543,13 +23487,8 @@
       </w:r>
       <w:proofErr w:type="gramEnd"/>
       <w:r>
-        <w:t xml:space="preserve"> This function implements the commonly called “launch assist” and “burn out</w:t>
-      </w:r>
-      <w:proofErr w:type="gramStart"/>
-      <w:r>
-        <w:t>”.</w:t>
-      </w:r>
-      <w:proofErr w:type="gramEnd"/>
+        <w:t xml:space="preserve"> This function implements the commonly called “launch assist” and “burn out”.</w:t>
+      </w:r>
     </w:p>
     <w:p>
       <w:r>
@@ -23577,15 +23516,7 @@
         <w:t>Note2</w:t>
       </w:r>
       <w:r>
-        <w:t xml:space="preserve">: before using this function, it is necessary to enable the DYNO </w:t>
-      </w:r>
-      <w:proofErr w:type="gramStart"/>
-      <w:r>
-        <w:t>in order to</w:t>
-      </w:r>
-      <w:proofErr w:type="gramEnd"/>
-      <w:r>
-        <w:t xml:space="preserve"> ensure maximum power delivery to the wheels.</w:t>
+        <w:t>: before using this function, it is necessary to enable the DYNO in order to ensure maximum power delivery to the wheels.</w:t>
       </w:r>
     </w:p>
     <w:p>
@@ -23598,7 +23529,7 @@
         </w:rPr>
       </w:pPr>
       <w:bookmarkStart w:id="36" w:name="_Toc205138696"/>
-      <w:bookmarkStart w:id="37" w:name="_Toc212741494"/>
+      <w:bookmarkStart w:id="37" w:name="_Toc238374771"/>
       <w:r>
         <w:rPr>
           <w:rStyle w:val="Enfasigrassetto"/>
@@ -23687,14 +23618,14 @@
         </w:rPr>
       </w:pPr>
       <w:bookmarkStart w:id="38" w:name="_Toc205138697"/>
-      <w:bookmarkStart w:id="39" w:name="_Toc212741495"/>
+      <w:bookmarkStart w:id="39" w:name="_Toc238374772"/>
       <w:r>
         <w:rPr>
           <w:rStyle w:val="Enfasigrassetto"/>
           <w:rFonts w:asciiTheme="minorHAnsi" w:hAnsiTheme="minorHAnsi" w:cstheme="minorHAnsi"/>
           <w:color w:val="auto"/>
         </w:rPr>
-        <w:t>2.16.1</w:t>
+        <w:t>2.16.</w:t>
       </w:r>
       <w:r>
         <w:rPr>
@@ -23702,184 +23633,171 @@
           <w:rFonts w:asciiTheme="minorHAnsi" w:hAnsiTheme="minorHAnsi" w:cstheme="minorHAnsi"/>
           <w:color w:val="auto"/>
         </w:rPr>
-        <w:tab/>
-        <w:t>Burn Out</w:t>
-      </w:r>
-      <w:bookmarkEnd w:id="38"/>
-      <w:bookmarkEnd w:id="39"/>
-    </w:p>
-    <w:p>
-      <w:pPr>
-        <w:jc w:val="both"/>
-      </w:pPr>
-      <w:r>
-        <w:t>By moving to</w:t>
-      </w:r>
-      <w:r>
-        <w:t xml:space="preserve"> the </w:t>
-      </w:r>
-      <w:proofErr w:type="spellStart"/>
-      <w:r>
-        <w:t>Baccable’s</w:t>
-      </w:r>
-      <w:proofErr w:type="spellEnd"/>
-      <w:r>
-        <w:t xml:space="preserve"> </w:t>
-      </w:r>
-      <w:r>
-        <w:t>main menu, on the “Front Brake Normal”</w:t>
-      </w:r>
-      <w:r>
-        <w:t xml:space="preserve"> item</w:t>
-      </w:r>
-      <w:r>
-        <w:t xml:space="preserve">, with the engine running, the car without the handbrake engaged, and the brake pedal released, </w:t>
-      </w:r>
-      <w:proofErr w:type="gramStart"/>
-      <w:r>
-        <w:t>pressing</w:t>
-      </w:r>
-      <w:proofErr w:type="gramEnd"/>
-      <w:r>
-        <w:t xml:space="preserve"> and immediately releasing the RES button (or DISTANCE button) on the steering wheel, the menu will display “Front Brake Assist” and the brake engagement will be perceptible. Only the </w:t>
-      </w:r>
-      <w:proofErr w:type="spellStart"/>
-      <w:r>
-        <w:t>calipers</w:t>
-      </w:r>
-      <w:proofErr w:type="spellEnd"/>
-      <w:r>
-        <w:t xml:space="preserve"> of the front wheels will be activated. Pressing the RES button again, the dashboard will display the message “Front Brake FORCED</w:t>
-      </w:r>
-      <w:proofErr w:type="gramStart"/>
-      <w:r>
-        <w:t>”.</w:t>
-      </w:r>
-      <w:proofErr w:type="gramEnd"/>
-    </w:p>
-    <w:p>
-      <w:pPr>
-        <w:jc w:val="both"/>
-      </w:pPr>
-      <w:r>
-        <w:t>In this mode, the brake will be released only by pressing the RES button again.</w:t>
-      </w:r>
-    </w:p>
-    <w:p>
-      <w:r>
-        <w:t>Pressing and immediately releasing the RES button (or DISTANCE button) again will release the brake and the menu will show “Front Brake Normal” again.</w:t>
-      </w:r>
-    </w:p>
-    <w:p>
-      <w:r>
-        <w:rPr>
-          <w:b/>
-          <w:bCs/>
-        </w:rPr>
-        <w:t xml:space="preserve">Note </w:t>
-      </w:r>
-      <w:r>
-        <w:rPr>
-          <w:b/>
-          <w:bCs/>
-        </w:rPr>
-        <w:t>3</w:t>
-      </w:r>
-      <w:r>
-        <w:rPr>
-          <w:b/>
-          <w:bCs/>
-        </w:rPr>
-        <w:t>:</w:t>
-      </w:r>
-      <w:r>
-        <w:t xml:space="preserve"> For a proper burnout on 2WD vehicles, it is </w:t>
-      </w:r>
-      <w:r>
-        <w:t xml:space="preserve">mandatory </w:t>
-      </w:r>
-      <w:r>
-        <w:t>to first disable stability controls by activating the DYNO function. Then activate the front brakes using the function described in this section. After a few seconds of throttle application and once smoke appears from the rear tires, press the button again to release the front brakes.</w:t>
-      </w:r>
-    </w:p>
-    <w:p>
-      <w:r>
-        <w:rPr>
-          <w:b/>
-          <w:bCs/>
-        </w:rPr>
-        <w:lastRenderedPageBreak/>
-        <w:t xml:space="preserve">Note </w:t>
-      </w:r>
-      <w:r>
-        <w:rPr>
-          <w:b/>
-          <w:bCs/>
-        </w:rPr>
-        <w:t>4</w:t>
-      </w:r>
-      <w:r>
-        <w:rPr>
-          <w:b/>
-          <w:bCs/>
-        </w:rPr>
-        <w:t>:</w:t>
-      </w:r>
-      <w:r>
-        <w:t xml:space="preserve"> This function can only be activated while the vehicle is stationary.</w:t>
-      </w:r>
-    </w:p>
-    <w:p>
-      <w:r>
-        <w:rPr>
-          <w:b/>
-          <w:bCs/>
-        </w:rPr>
-        <w:t>WARNING:</w:t>
-      </w:r>
-      <w:r>
-        <w:t xml:space="preserve"> It is strongly recommended to deactivate the BRAKES OVERRIDE function via the SETUP menu when not in use.</w:t>
-      </w:r>
-    </w:p>
-    <w:p>
-      <w:r>
-        <w:rPr>
-          <w:b/>
-          <w:bCs/>
-        </w:rPr>
-        <w:t>WARNING:</w:t>
-      </w:r>
-      <w:r>
-        <w:t xml:space="preserve"> This function causes significant stress on all mechanical components involved, including suspension, half-shafts, clutch, and flywheel. Apply throttle decisively to quickly overcome the tires’ initial friction, which is the point of highest mechanical stress.</w:t>
-      </w:r>
-    </w:p>
-    <w:p/>
-    <w:p>
-      <w:pPr>
-        <w:pStyle w:val="Titolo2"/>
-        <w:jc w:val="both"/>
+        <w:t>2</w:t>
+      </w:r>
+      <w:r>
         <w:rPr>
           <w:rStyle w:val="Enfasigrassetto"/>
           <w:rFonts w:asciiTheme="minorHAnsi" w:hAnsiTheme="minorHAnsi" w:cstheme="minorHAnsi"/>
           <w:color w:val="auto"/>
         </w:rPr>
-      </w:pPr>
-      <w:bookmarkStart w:id="40" w:name="_Toc212741496"/>
-      <w:r>
+        <w:tab/>
+        <w:t>Burn Out</w:t>
+      </w:r>
+      <w:bookmarkEnd w:id="38"/>
+      <w:bookmarkEnd w:id="39"/>
+    </w:p>
+    <w:p>
+      <w:pPr>
+        <w:jc w:val="both"/>
+      </w:pPr>
+      <w:r>
+        <w:t>By moving to</w:t>
+      </w:r>
+      <w:r>
+        <w:t xml:space="preserve"> the </w:t>
+      </w:r>
+      <w:proofErr w:type="spellStart"/>
+      <w:r>
+        <w:t>Baccable’s</w:t>
+      </w:r>
+      <w:proofErr w:type="spellEnd"/>
+      <w:r>
+        <w:t xml:space="preserve"> </w:t>
+      </w:r>
+      <w:r>
+        <w:t>main menu, on the “Front Brake Normal”</w:t>
+      </w:r>
+      <w:r>
+        <w:t xml:space="preserve"> item</w:t>
+      </w:r>
+      <w:r>
+        <w:t xml:space="preserve">, with the engine running, the car without the handbrake engaged, and the brake pedal released, pressing and immediately releasing the RES button (or DISTANCE button) on the steering wheel, the menu will display “Front Brake Assist” and the brake engagement will be perceptible. Only the </w:t>
+      </w:r>
+      <w:proofErr w:type="spellStart"/>
+      <w:r>
+        <w:t>calipers</w:t>
+      </w:r>
+      <w:proofErr w:type="spellEnd"/>
+      <w:r>
+        <w:t xml:space="preserve"> of the front wheels will be activated. Pressing the RES button again, the dashboard will display the message “Front Brake FORCED”.</w:t>
+      </w:r>
+    </w:p>
+    <w:p>
+      <w:pPr>
+        <w:jc w:val="both"/>
+      </w:pPr>
+      <w:r>
+        <w:t>In this mode, the brake will be released only by pressing the RES button again.</w:t>
+      </w:r>
+    </w:p>
+    <w:p>
+      <w:r>
+        <w:t>Pressing and immediately releasing the RES button (or DISTANCE button) again will release the brake and the menu will show “Front Brake Normal” again.</w:t>
+      </w:r>
+    </w:p>
+    <w:p>
+      <w:r>
+        <w:rPr>
+          <w:b/>
+          <w:bCs/>
+        </w:rPr>
+        <w:t xml:space="preserve">Note </w:t>
+      </w:r>
+      <w:r>
+        <w:rPr>
+          <w:b/>
+          <w:bCs/>
+        </w:rPr>
+        <w:t>3</w:t>
+      </w:r>
+      <w:r>
+        <w:rPr>
+          <w:b/>
+          <w:bCs/>
+        </w:rPr>
+        <w:t>:</w:t>
+      </w:r>
+      <w:r>
+        <w:t xml:space="preserve"> For a proper burnout on 2WD vehicles, it is </w:t>
+      </w:r>
+      <w:r>
+        <w:t xml:space="preserve">mandatory </w:t>
+      </w:r>
+      <w:r>
+        <w:t>to first disable stability controls by activating the DYNO function. Then activate the front brakes using the function described in this section. After a few seconds of throttle application and once smoke appears from the rear tires, press the button again to release the front brakes.</w:t>
+      </w:r>
+    </w:p>
+    <w:p>
+      <w:r>
+        <w:rPr>
+          <w:b/>
+          <w:bCs/>
+        </w:rPr>
+        <w:lastRenderedPageBreak/>
+        <w:t xml:space="preserve">Note </w:t>
+      </w:r>
+      <w:r>
+        <w:rPr>
+          <w:b/>
+          <w:bCs/>
+        </w:rPr>
+        <w:t>4</w:t>
+      </w:r>
+      <w:r>
+        <w:rPr>
+          <w:b/>
+          <w:bCs/>
+        </w:rPr>
+        <w:t>:</w:t>
+      </w:r>
+      <w:r>
+        <w:t xml:space="preserve"> This function can only be activated while the vehicle is stationary.</w:t>
+      </w:r>
+    </w:p>
+    <w:p>
+      <w:r>
+        <w:rPr>
+          <w:b/>
+          <w:bCs/>
+        </w:rPr>
+        <w:t>WARNING:</w:t>
+      </w:r>
+      <w:r>
+        <w:t xml:space="preserve"> It is strongly recommended to deactivate the BRAKES OVERRIDE function via the SETUP menu when not in use.</w:t>
+      </w:r>
+    </w:p>
+    <w:p>
+      <w:r>
+        <w:rPr>
+          <w:b/>
+          <w:bCs/>
+        </w:rPr>
+        <w:t>WARNING:</w:t>
+      </w:r>
+      <w:r>
+        <w:t xml:space="preserve"> This function causes significant stress on all mechanical components involved, including suspension, half-shafts, clutch, and flywheel. Apply throttle decisively to quickly overcome the tires’ initial friction, which is the point of highest mechanical stress.</w:t>
+      </w:r>
+    </w:p>
+    <w:p/>
+    <w:p>
+      <w:pPr>
+        <w:pStyle w:val="Titolo2"/>
+        <w:jc w:val="both"/>
         <w:rPr>
           <w:rStyle w:val="Enfasigrassetto"/>
           <w:rFonts w:asciiTheme="minorHAnsi" w:hAnsiTheme="minorHAnsi" w:cstheme="minorHAnsi"/>
           <w:color w:val="auto"/>
         </w:rPr>
-        <w:t>2.17 </w:t>
-      </w:r>
+      </w:pPr>
+      <w:bookmarkStart w:id="40" w:name="_Toc238374773"/>
       <w:r>
         <w:rPr>
           <w:rStyle w:val="Enfasigrassetto"/>
           <w:rFonts w:asciiTheme="minorHAnsi" w:hAnsiTheme="minorHAnsi" w:cstheme="minorHAnsi"/>
           <w:color w:val="auto"/>
         </w:rPr>
-        <w:tab/>
+        <w:t>2.17 </w:t>
       </w:r>
       <w:r>
         <w:rPr>
@@ -23887,53 +23805,53 @@
           <w:rFonts w:asciiTheme="minorHAnsi" w:hAnsiTheme="minorHAnsi" w:cstheme="minorHAnsi"/>
           <w:color w:val="auto"/>
         </w:rPr>
-        <w:t>REMOTE START</w:t>
-      </w:r>
-      <w:bookmarkEnd w:id="40"/>
-    </w:p>
-    <w:p/>
-    <w:p>
-      <w:pPr>
-        <w:rPr>
-          <w:b/>
-          <w:bCs/>
-        </w:rPr>
-      </w:pPr>
-      <w:r>
-        <w:rPr>
-          <w:b/>
-          <w:bCs/>
-        </w:rPr>
-        <w:t>Under development. Do not activate this function.</w:t>
-      </w:r>
-    </w:p>
-    <w:p/>
-    <w:p>
-      <w:pPr>
-        <w:pStyle w:val="Titolo2"/>
-        <w:jc w:val="both"/>
+        <w:tab/>
+      </w:r>
+      <w:r>
         <w:rPr>
           <w:rStyle w:val="Enfasigrassetto"/>
           <w:rFonts w:asciiTheme="minorHAnsi" w:hAnsiTheme="minorHAnsi" w:cstheme="minorHAnsi"/>
           <w:color w:val="auto"/>
         </w:rPr>
-      </w:pPr>
-      <w:bookmarkStart w:id="41" w:name="_Toc212741497"/>
-      <w:r>
+        <w:t>REMOTE START</w:t>
+      </w:r>
+      <w:bookmarkEnd w:id="40"/>
+    </w:p>
+    <w:p/>
+    <w:p>
+      <w:pPr>
+        <w:rPr>
+          <w:b/>
+          <w:bCs/>
+        </w:rPr>
+      </w:pPr>
+      <w:r>
+        <w:rPr>
+          <w:b/>
+          <w:bCs/>
+        </w:rPr>
+        <w:t>Under development. Do not activate this function.</w:t>
+      </w:r>
+    </w:p>
+    <w:p/>
+    <w:p>
+      <w:pPr>
+        <w:pStyle w:val="Titolo2"/>
+        <w:jc w:val="both"/>
         <w:rPr>
           <w:rStyle w:val="Enfasigrassetto"/>
           <w:rFonts w:asciiTheme="minorHAnsi" w:hAnsiTheme="minorHAnsi" w:cstheme="minorHAnsi"/>
           <w:color w:val="auto"/>
         </w:rPr>
-        <w:t>2.18 </w:t>
-      </w:r>
+      </w:pPr>
+      <w:bookmarkStart w:id="41" w:name="_Toc238374774"/>
       <w:r>
         <w:rPr>
           <w:rStyle w:val="Enfasigrassetto"/>
           <w:rFonts w:asciiTheme="minorHAnsi" w:hAnsiTheme="minorHAnsi" w:cstheme="minorHAnsi"/>
           <w:color w:val="auto"/>
         </w:rPr>
-        <w:tab/>
+        <w:t>2.18 </w:t>
       </w:r>
       <w:r>
         <w:rPr>
@@ -23941,346 +23859,354 @@
           <w:rFonts w:asciiTheme="minorHAnsi" w:hAnsiTheme="minorHAnsi" w:cstheme="minorHAnsi"/>
           <w:color w:val="auto"/>
         </w:rPr>
-        <w:t>READ FAULTS</w:t>
-      </w:r>
-      <w:bookmarkEnd w:id="41"/>
-    </w:p>
-    <w:p/>
-    <w:p>
-      <w:pPr>
-        <w:rPr>
-          <w:b/>
-          <w:bCs/>
-        </w:rPr>
-      </w:pPr>
-      <w:r>
-        <w:rPr>
-          <w:b/>
-          <w:bCs/>
-        </w:rPr>
-        <w:t>Under development. Do not activate this function.</w:t>
-      </w:r>
-    </w:p>
-    <w:p>
-      <w:pPr>
-        <w:rPr>
-          <w:b/>
-          <w:bCs/>
-        </w:rPr>
-      </w:pPr>
-    </w:p>
-    <w:p>
-      <w:pPr>
-        <w:pStyle w:val="Titolo2"/>
+        <w:tab/>
+      </w:r>
+      <w:r>
         <w:rPr>
           <w:rStyle w:val="Enfasigrassetto"/>
           <w:rFonts w:asciiTheme="minorHAnsi" w:hAnsiTheme="minorHAnsi" w:cstheme="minorHAnsi"/>
           <w:color w:val="auto"/>
         </w:rPr>
-      </w:pPr>
-      <w:bookmarkStart w:id="42" w:name="_Toc205138700"/>
-      <w:bookmarkStart w:id="43" w:name="_Toc212741498"/>
-      <w:r>
+        <w:t>READ FAULTS</w:t>
+      </w:r>
+      <w:bookmarkEnd w:id="41"/>
+    </w:p>
+    <w:p/>
+    <w:p>
+      <w:pPr>
+        <w:rPr>
+          <w:b/>
+          <w:bCs/>
+        </w:rPr>
+      </w:pPr>
+      <w:r>
+        <w:rPr>
+          <w:b/>
+          <w:bCs/>
+        </w:rPr>
+        <w:t>Under development. Do not activate this function.</w:t>
+      </w:r>
+    </w:p>
+    <w:p>
+      <w:pPr>
+        <w:rPr>
+          <w:b/>
+          <w:bCs/>
+        </w:rPr>
+      </w:pPr>
+    </w:p>
+    <w:p>
+      <w:pPr>
+        <w:pStyle w:val="Titolo2"/>
         <w:rPr>
           <w:rStyle w:val="Enfasigrassetto"/>
           <w:rFonts w:asciiTheme="minorHAnsi" w:hAnsiTheme="minorHAnsi" w:cstheme="minorHAnsi"/>
           <w:color w:val="auto"/>
         </w:rPr>
-        <w:t>2.19</w:t>
-      </w:r>
+      </w:pPr>
+      <w:bookmarkStart w:id="42" w:name="_Toc205138700"/>
+      <w:bookmarkStart w:id="43" w:name="_Toc238374775"/>
       <w:r>
         <w:rPr>
           <w:rStyle w:val="Enfasigrassetto"/>
           <w:rFonts w:asciiTheme="minorHAnsi" w:hAnsiTheme="minorHAnsi" w:cstheme="minorHAnsi"/>
           <w:color w:val="auto"/>
         </w:rPr>
-        <w:tab/>
-        <w:t>ODOMETER BLINK</w:t>
-      </w:r>
-      <w:bookmarkEnd w:id="42"/>
-      <w:bookmarkEnd w:id="43"/>
-    </w:p>
-    <w:p>
-      <w:pPr>
-        <w:jc w:val="both"/>
-        <w:rPr>
-          <w:b/>
-          <w:bCs/>
-        </w:rPr>
-      </w:pPr>
-      <w:r>
-        <w:rPr>
-          <w:b/>
-          <w:bCs/>
-        </w:rPr>
         <w:t>2.19</w:t>
       </w:r>
       <w:r>
-        <w:rPr>
-          <w:b/>
-          <w:bCs/>
-        </w:rPr>
-        <w:tab/>
-        <w:t>ODOMETER BLINK</w:t>
-      </w:r>
-    </w:p>
-    <w:p>
-      <w:pPr>
-        <w:jc w:val="both"/>
-      </w:pPr>
-      <w:r>
-        <w:rPr>
-          <w:b/>
-          <w:bCs/>
-        </w:rPr>
-        <w:t xml:space="preserve">Brief description: </w:t>
-      </w:r>
-      <w:r>
-        <w:t>Hides the odometer blinking on the dashboard.</w:t>
-      </w:r>
-    </w:p>
-    <w:p>
-      <w:pPr>
-        <w:jc w:val="both"/>
-      </w:pPr>
-      <w:r>
-        <w:rPr>
-          <w:b/>
-          <w:bCs/>
-        </w:rPr>
-        <w:t xml:space="preserve">Note: </w:t>
-      </w:r>
-      <w:r>
-        <w:t>This is a function that can be enabled and disabled from the SETUP MENU described in para.2.1.</w:t>
-      </w:r>
-    </w:p>
-    <w:p>
-      <w:pPr>
-        <w:jc w:val="both"/>
-      </w:pPr>
-      <w:r>
-        <w:t>Typically, the odometer blinks to indicate an unsuccessful proxy alignment. Once this function is enabled, the odometer blinking will be stopped.</w:t>
-      </w:r>
-    </w:p>
-    <w:p>
-      <w:pPr>
-        <w:jc w:val="both"/>
-      </w:pPr>
-      <w:r>
-        <w:t>One of the applications of this function is summarized below:</w:t>
-      </w:r>
-    </w:p>
-    <w:p>
-      <w:pPr>
-        <w:jc w:val="both"/>
-      </w:pPr>
-      <w:r>
-        <w:rPr>
-          <w:b/>
-          <w:bCs/>
-        </w:rPr>
-        <w:t xml:space="preserve">Premise: </w:t>
-      </w:r>
-      <w:r>
-        <w:t xml:space="preserve">Proxy alignment is a procedure to be performed with </w:t>
-      </w:r>
-      <w:proofErr w:type="spellStart"/>
-      <w:r>
-        <w:t>Multiecuscan</w:t>
-      </w:r>
-      <w:proofErr w:type="spellEnd"/>
-      <w:r>
-        <w:t>, an elm327 and suitable cables, which synchronizes the electronic control units (ECUs) with each other so that all modules recognize the current vehicle configuration. Among these configurations is the activation of race mode, which allows the ESC/TC function of the BACCABLE to be used without installing the RDNA selector. The activation of race mode via alignment procedure is well described at the following link: https://giuliatech.com/t/how-to-enable-race-mode-on-non-qv-giulia-2017-2024/21</w:t>
-      </w:r>
-    </w:p>
-    <w:p>
-      <w:pPr>
-        <w:jc w:val="both"/>
-      </w:pPr>
-      <w:r>
-        <w:t xml:space="preserve">The </w:t>
-      </w:r>
-      <w:r>
-        <w:t xml:space="preserve">above </w:t>
-      </w:r>
-      <w:r>
-        <w:t xml:space="preserve">procedure describes the necessary steps for hardware modification of the vehicle and those for proxy alignment. The part relevant to use with the </w:t>
-      </w:r>
-      <w:proofErr w:type="spellStart"/>
-      <w:r>
-        <w:t>Baccable</w:t>
-      </w:r>
-      <w:proofErr w:type="spellEnd"/>
-      <w:r>
-        <w:t xml:space="preserve"> is only the proxy alignment section.</w:t>
-      </w:r>
-    </w:p>
-    <w:p>
-      <w:pPr>
-        <w:jc w:val="both"/>
-      </w:pPr>
-    </w:p>
-    <w:p>
-      <w:pPr>
-        <w:jc w:val="both"/>
-      </w:pPr>
-      <w:r>
-        <w:t>Activating Race via Proxy alignment causes the loss of pedal maps, meaning all DNA driving styles adopt the N mode map, which has a linear curve, while Dynamic should have a very sensitive tip-in curve. To solve this issue, it is possible to disable race via proxy alignment on the engine ECU only. This way, the</w:t>
-      </w:r>
-      <w:r>
-        <w:rPr>
-          <w:b/>
-          <w:bCs/>
-        </w:rPr>
-        <w:t xml:space="preserve"> </w:t>
-      </w:r>
-      <w:r>
-        <w:t>pedal maps return</w:t>
-      </w:r>
-      <w:r>
-        <w:t xml:space="preserve"> to their</w:t>
-      </w:r>
-      <w:r>
-        <w:t xml:space="preserve"> correct curve, </w:t>
-      </w:r>
-      <w:r>
-        <w:t xml:space="preserve">and race remains available. To achieve this result, after </w:t>
-      </w:r>
-      <w:r>
-        <w:lastRenderedPageBreak/>
-        <w:t xml:space="preserve">successfully completing the race activation procedure as per the link in the Premise, simply </w:t>
-      </w:r>
-      <w:r>
-        <w:t xml:space="preserve">set, in </w:t>
-      </w:r>
-      <w:r>
-        <w:t xml:space="preserve">proxy </w:t>
-      </w:r>
-      <w:r>
-        <w:t xml:space="preserve">setup, the </w:t>
-      </w:r>
-      <w:r>
-        <w:t>selector type 1 (</w:t>
-      </w:r>
-      <w:r>
-        <w:t>meaning:</w:t>
-      </w:r>
-      <w:r>
-        <w:t xml:space="preserve"> disable race), disconnect the elm327 from the vehicle and start the </w:t>
-      </w:r>
-      <w:r>
-        <w:t xml:space="preserve">proxy </w:t>
-      </w:r>
-      <w:r>
-        <w:t xml:space="preserve">alignment procedure. The first ECU that MES will try to write is the body, then failing to do so (since the elm327 will be disconnected), it will report an error. At that moment, we must reconnect the elm327 because the second ECU to be written will be the engine ECU. As soon as successful writing of the engine ECU is reported, we must again remove the elm327, or disconnect the USB cable if using a USB elm327, to prevent </w:t>
-      </w:r>
-      <w:proofErr w:type="spellStart"/>
-      <w:r>
-        <w:t>Multiecuscan</w:t>
-      </w:r>
-      <w:proofErr w:type="spellEnd"/>
-      <w:r>
-        <w:t xml:space="preserve"> from writing the other ECUs. At this point, by turning the vehicle off and on again, after a while, the odometer will start blinking to indicate an incomplete proxy alignment, the pedal maps will work as originally intended, and the ESC/TC function of the BACCABLE will operate normally. To eliminate the annoying odometer blinking, we will select the ODOMETER BLINK function in the BACCABLE setup menu.</w:t>
-      </w:r>
-    </w:p>
-    <w:p>
-      <w:pPr>
-        <w:jc w:val="both"/>
-        <w:rPr>
-          <w:b/>
-          <w:bCs/>
-        </w:rPr>
-      </w:pPr>
-    </w:p>
-    <w:p>
-      <w:pPr>
-        <w:pStyle w:val="Titolo2"/>
         <w:rPr>
           <w:rStyle w:val="Enfasigrassetto"/>
           <w:rFonts w:asciiTheme="minorHAnsi" w:hAnsiTheme="minorHAnsi" w:cstheme="minorHAnsi"/>
           <w:color w:val="auto"/>
         </w:rPr>
-      </w:pPr>
-      <w:bookmarkStart w:id="44" w:name="_Toc205138701"/>
-      <w:bookmarkStart w:id="45" w:name="_Toc212741499"/>
-      <w:r>
+        <w:tab/>
+        <w:t>ODOMETER BLINK</w:t>
+      </w:r>
+      <w:bookmarkEnd w:id="42"/>
+      <w:bookmarkEnd w:id="43"/>
+    </w:p>
+    <w:p>
+      <w:pPr>
+        <w:jc w:val="both"/>
+        <w:rPr>
+          <w:b/>
+          <w:bCs/>
+        </w:rPr>
+      </w:pPr>
+      <w:r>
+        <w:rPr>
+          <w:b/>
+          <w:bCs/>
+        </w:rPr>
+        <w:t>2.19</w:t>
+      </w:r>
+      <w:r>
+        <w:rPr>
+          <w:b/>
+          <w:bCs/>
+        </w:rPr>
+        <w:tab/>
+        <w:t>ODOMETER BLINK</w:t>
+      </w:r>
+    </w:p>
+    <w:p>
+      <w:pPr>
+        <w:jc w:val="both"/>
+      </w:pPr>
+      <w:r>
+        <w:rPr>
+          <w:b/>
+          <w:bCs/>
+        </w:rPr>
+        <w:t xml:space="preserve">Brief description: </w:t>
+      </w:r>
+      <w:r>
+        <w:t>Hides the odometer blinking on the dashboard.</w:t>
+      </w:r>
+    </w:p>
+    <w:p>
+      <w:pPr>
+        <w:jc w:val="both"/>
+      </w:pPr>
+      <w:r>
+        <w:rPr>
+          <w:b/>
+          <w:bCs/>
+        </w:rPr>
+        <w:t xml:space="preserve">Note: </w:t>
+      </w:r>
+      <w:r>
+        <w:t>This is a function that can be enabled and disabled from the SETUP MENU described in para.2.1.</w:t>
+      </w:r>
+    </w:p>
+    <w:p>
+      <w:pPr>
+        <w:jc w:val="both"/>
+      </w:pPr>
+      <w:r>
+        <w:t>Typically, the odometer blinks to indicate an unsuccessful proxy alignment. Once this function is enabled, the odometer blinking will be stopped.</w:t>
+      </w:r>
+    </w:p>
+    <w:p>
+      <w:pPr>
+        <w:jc w:val="both"/>
+      </w:pPr>
+      <w:r>
+        <w:t>One of the applications of this function is summarized below:</w:t>
+      </w:r>
+    </w:p>
+    <w:p>
+      <w:pPr>
+        <w:jc w:val="both"/>
+      </w:pPr>
+      <w:r>
+        <w:rPr>
+          <w:b/>
+          <w:bCs/>
+        </w:rPr>
+        <w:t xml:space="preserve">Premise: </w:t>
+      </w:r>
+      <w:r>
+        <w:t xml:space="preserve">Proxy alignment is a procedure to be performed with </w:t>
+      </w:r>
+      <w:proofErr w:type="spellStart"/>
+      <w:r>
+        <w:t>Multiecuscan</w:t>
+      </w:r>
+      <w:proofErr w:type="spellEnd"/>
+      <w:r>
+        <w:t>, an elm327 and suitable cables, which synchronizes the electronic control units (ECUs) with each other so that all modules recognize the current vehicle configuration. Among these configurations is the activation of race mode, which allows the ESC/TC function of the BACCABLE to be used without installing the RDNA selector. The activation of race mode via alignment procedure is well described at the following link: https://giuliatech.com/t/how-to-enable-race-mode-on-non-qv-giulia-2017-2024/21</w:t>
+      </w:r>
+    </w:p>
+    <w:p>
+      <w:pPr>
+        <w:jc w:val="both"/>
+      </w:pPr>
+      <w:r>
+        <w:t xml:space="preserve">The </w:t>
+      </w:r>
+      <w:r>
+        <w:t xml:space="preserve">above </w:t>
+      </w:r>
+      <w:r>
+        <w:t xml:space="preserve">procedure describes the necessary steps for hardware modification of the vehicle and those for proxy alignment. The part relevant to use with the </w:t>
+      </w:r>
+      <w:proofErr w:type="spellStart"/>
+      <w:r>
+        <w:t>Baccable</w:t>
+      </w:r>
+      <w:proofErr w:type="spellEnd"/>
+      <w:r>
+        <w:t xml:space="preserve"> is only the proxy alignment section.</w:t>
+      </w:r>
+    </w:p>
+    <w:p>
+      <w:pPr>
+        <w:jc w:val="both"/>
+      </w:pPr>
+    </w:p>
+    <w:p>
+      <w:pPr>
+        <w:jc w:val="both"/>
+      </w:pPr>
+      <w:r>
+        <w:t>Activating Race via Proxy alignment causes the loss of pedal maps, meaning all DNA driving styles adopt the N mode map, which has a linear curve, while Dynamic should have a very sensitive tip-in curve. To solve this issue, it is possible to disable race via proxy alignment on the engine ECU only. This way, the</w:t>
+      </w:r>
+      <w:r>
+        <w:rPr>
+          <w:b/>
+          <w:bCs/>
+        </w:rPr>
+        <w:t xml:space="preserve"> </w:t>
+      </w:r>
+      <w:r>
+        <w:t>pedal maps return</w:t>
+      </w:r>
+      <w:r>
+        <w:t xml:space="preserve"> to their</w:t>
+      </w:r>
+      <w:r>
+        <w:t xml:space="preserve"> correct curve, </w:t>
+      </w:r>
+      <w:r>
+        <w:t xml:space="preserve">and race remains available. To achieve this result, after </w:t>
+      </w:r>
+      <w:r>
+        <w:lastRenderedPageBreak/>
+        <w:t xml:space="preserve">successfully completing the race activation procedure as per the link in the Premise, simply </w:t>
+      </w:r>
+      <w:r>
+        <w:t xml:space="preserve">set, in </w:t>
+      </w:r>
+      <w:r>
+        <w:t xml:space="preserve">proxy </w:t>
+      </w:r>
+      <w:r>
+        <w:t xml:space="preserve">setup, the </w:t>
+      </w:r>
+      <w:r>
+        <w:t>selector type 1 (</w:t>
+      </w:r>
+      <w:r>
+        <w:t>meaning:</w:t>
+      </w:r>
+      <w:r>
+        <w:t xml:space="preserve"> disable race), disconnect the elm327 from the vehicle and start the </w:t>
+      </w:r>
+      <w:r>
+        <w:t xml:space="preserve">proxy </w:t>
+      </w:r>
+      <w:r>
+        <w:t xml:space="preserve">alignment procedure. The first ECU that MES will try to write is the body, then failing to do so (since the elm327 will be disconnected), it will report an error. At that moment, we must reconnect the elm327 because the second ECU to be written will be the engine ECU. As soon as successful writing of the engine ECU is reported, we must again remove the elm327, or disconnect the USB cable if using a USB elm327, to prevent </w:t>
+      </w:r>
+      <w:proofErr w:type="spellStart"/>
+      <w:r>
+        <w:t>Multiecuscan</w:t>
+      </w:r>
+      <w:proofErr w:type="spellEnd"/>
+      <w:r>
+        <w:t xml:space="preserve"> from writing the other ECUs. At this point, by turning the vehicle off and on again, after a while, the odometer will start blinking to indicate an incomplete proxy alignment, the pedal maps will work as originally intended, and the ESC/TC function of the BACCABLE will operate normally. To eliminate the annoying odometer blinking, we will select the ODOMETER BLINK function in the BACCABLE setup menu.</w:t>
+      </w:r>
+    </w:p>
+    <w:p>
+      <w:pPr>
+        <w:jc w:val="both"/>
+        <w:rPr>
+          <w:b/>
+          <w:bCs/>
+        </w:rPr>
+      </w:pPr>
+    </w:p>
+    <w:p>
+      <w:pPr>
+        <w:pStyle w:val="Titolo2"/>
         <w:rPr>
           <w:rStyle w:val="Enfasigrassetto"/>
           <w:rFonts w:asciiTheme="minorHAnsi" w:hAnsiTheme="minorHAnsi" w:cstheme="minorHAnsi"/>
           <w:color w:val="auto"/>
         </w:rPr>
-        <w:t>2.20</w:t>
-      </w:r>
+      </w:pPr>
+      <w:bookmarkStart w:id="44" w:name="_Toc205138701"/>
+      <w:bookmarkStart w:id="45" w:name="_Toc238374776"/>
       <w:r>
         <w:rPr>
           <w:rStyle w:val="Enfasigrassetto"/>
           <w:rFonts w:asciiTheme="minorHAnsi" w:hAnsiTheme="minorHAnsi" w:cstheme="minorHAnsi"/>
           <w:color w:val="auto"/>
         </w:rPr>
-        <w:tab/>
-        <w:t>SEAT BELT ALARM</w:t>
-      </w:r>
-      <w:bookmarkEnd w:id="44"/>
-      <w:bookmarkEnd w:id="45"/>
-    </w:p>
-    <w:p>
-      <w:pPr>
-        <w:jc w:val="both"/>
-      </w:pPr>
-      <w:r>
-        <w:rPr>
-          <w:b/>
-          <w:bCs/>
-        </w:rPr>
-        <w:t xml:space="preserve">Brief description: </w:t>
-      </w:r>
-      <w:r>
-        <w:t>Disables the acoustic warning indicating unfastened seat belts.</w:t>
-      </w:r>
-    </w:p>
-    <w:p>
-      <w:pPr>
-        <w:jc w:val="both"/>
-      </w:pPr>
-      <w:r>
-        <w:rPr>
-          <w:b/>
-          <w:bCs/>
-        </w:rPr>
-        <w:t>Note</w:t>
-      </w:r>
-      <w:r>
-        <w:t>: This is a function that can be enabled and disabled from the SETUP MENU described in para.2.1.</w:t>
-      </w:r>
-    </w:p>
-    <w:p>
-      <w:pPr>
-        <w:jc w:val="both"/>
-      </w:pPr>
-      <w:r>
-        <w:t>By deselecting this function in the setup menu, the acoustic warning indicating unfastened seat belts is disabled. The setting is permanent even after removing the BACCABLE and may require a restart to take effect</w:t>
-      </w:r>
-    </w:p>
-    <w:p>
-      <w:pPr>
-        <w:jc w:val="both"/>
-        <w:rPr>
-          <w:b/>
-          <w:bCs/>
-        </w:rPr>
-      </w:pPr>
-    </w:p>
-    <w:p>
-      <w:pPr>
-        <w:pStyle w:val="Titolo2"/>
+        <w:t>2.20</w:t>
+      </w:r>
+      <w:r>
         <w:rPr>
           <w:rStyle w:val="Enfasigrassetto"/>
           <w:rFonts w:asciiTheme="minorHAnsi" w:hAnsiTheme="minorHAnsi" w:cstheme="minorHAnsi"/>
           <w:color w:val="auto"/>
         </w:rPr>
+        <w:tab/>
+        <w:t>SEAT BELT ALARM</w:t>
+      </w:r>
+      <w:bookmarkEnd w:id="44"/>
+      <w:bookmarkEnd w:id="45"/>
+    </w:p>
+    <w:p>
+      <w:pPr>
+        <w:jc w:val="both"/>
+      </w:pPr>
+      <w:r>
+        <w:rPr>
+          <w:b/>
+          <w:bCs/>
+        </w:rPr>
+        <w:t xml:space="preserve">Brief description: </w:t>
+      </w:r>
+      <w:r>
+        <w:t>Disables the acoustic warning indicating unfastened seat belts.</w:t>
+      </w:r>
+    </w:p>
+    <w:p>
+      <w:pPr>
+        <w:jc w:val="both"/>
+      </w:pPr>
+      <w:r>
+        <w:rPr>
+          <w:b/>
+          <w:bCs/>
+        </w:rPr>
+        <w:t>Note</w:t>
+      </w:r>
+      <w:r>
+        <w:t>: This is a function that can be enabled and disabled from the SETUP MENU described in para.2.1.</w:t>
+      </w:r>
+    </w:p>
+    <w:p>
+      <w:pPr>
+        <w:jc w:val="both"/>
+      </w:pPr>
+      <w:r>
+        <w:t>By deselecting this function in the setup menu, the acoustic warning indicating unfastened seat belts is disabled. The setting is permanent even after removing the BACCABLE and may require a restart to take effect</w:t>
+      </w:r>
+    </w:p>
+    <w:p>
+      <w:pPr>
+        <w:jc w:val="both"/>
+        <w:rPr>
+          <w:b/>
+          <w:bCs/>
+        </w:rPr>
+      </w:pPr>
+    </w:p>
+    <w:p>
+      <w:pPr>
+        <w:pStyle w:val="Titolo2"/>
+        <w:rPr>
+          <w:rStyle w:val="Enfasigrassetto"/>
+          <w:rFonts w:asciiTheme="minorHAnsi" w:hAnsiTheme="minorHAnsi" w:cstheme="minorHAnsi"/>
+          <w:color w:val="auto"/>
+        </w:rPr>
       </w:pPr>
       <w:bookmarkStart w:id="46" w:name="_Toc205138702"/>
-      <w:bookmarkStart w:id="47" w:name="_Toc212741500"/>
+      <w:bookmarkStart w:id="47" w:name="_Toc238374777"/>
       <w:r>
         <w:rPr>
           <w:rStyle w:val="Enfasigrassetto"/>
@@ -24480,15 +24406,7 @@
         <w:t>Pedal Booster A Map</w:t>
       </w:r>
       <w:r>
-        <w:t xml:space="preserve">: the function forces the use of the pedal map associated with driving style A (All weather), appropriately </w:t>
-      </w:r>
-      <w:proofErr w:type="gramStart"/>
-      <w:r>
-        <w:t>amplifying</w:t>
-      </w:r>
-      <w:proofErr w:type="gramEnd"/>
-      <w:r>
-        <w:t xml:space="preserve"> and attenuating the </w:t>
+        <w:t xml:space="preserve">: the function forces the use of the pedal map associated with driving style A (All weather), appropriately amplifying and attenuating the </w:t>
       </w:r>
       <w:proofErr w:type="spellStart"/>
       <w:r>
@@ -24515,15 +24433,7 @@
         <w:t>Pedal Booster N Map</w:t>
       </w:r>
       <w:r>
-        <w:t xml:space="preserve">: the function forces the use of the pedal map associated with driving style N (Natural), appropriately </w:t>
-      </w:r>
-      <w:proofErr w:type="gramStart"/>
-      <w:r>
-        <w:t>amplifying</w:t>
-      </w:r>
-      <w:proofErr w:type="gramEnd"/>
-      <w:r>
-        <w:t xml:space="preserve"> and attenuating the </w:t>
+        <w:t xml:space="preserve">: the function forces the use of the pedal map associated with driving style N (Natural), appropriately amplifying and attenuating the </w:t>
       </w:r>
       <w:proofErr w:type="spellStart"/>
       <w:r>
@@ -24550,15 +24460,7 @@
         <w:t>Pedal Booster D Map</w:t>
       </w:r>
       <w:r>
-        <w:t xml:space="preserve">: the function forces the use of the pedal map associated with driving style D (Dynamic), appropriately </w:t>
-      </w:r>
-      <w:proofErr w:type="gramStart"/>
-      <w:r>
-        <w:t>amplifying</w:t>
-      </w:r>
-      <w:proofErr w:type="gramEnd"/>
-      <w:r>
-        <w:t xml:space="preserve"> and attenuating the </w:t>
+        <w:t xml:space="preserve">: the function forces the use of the pedal map associated with driving style D (Dynamic), appropriately amplifying and attenuating the </w:t>
       </w:r>
       <w:proofErr w:type="spellStart"/>
       <w:r>
@@ -24585,15 +24487,7 @@
         <w:t>Pedal Booster R Map</w:t>
       </w:r>
       <w:r>
-        <w:t xml:space="preserve">: the function forces the use of the pedal map associated with driving style R (Race), appropriately </w:t>
-      </w:r>
-      <w:proofErr w:type="gramStart"/>
-      <w:r>
-        <w:t>amplifying</w:t>
-      </w:r>
-      <w:proofErr w:type="gramEnd"/>
-      <w:r>
-        <w:t xml:space="preserve"> and attenuating the </w:t>
+        <w:t xml:space="preserve">: the function forces the use of the pedal map associated with driving style R (Race), appropriately amplifying and attenuating the </w:t>
       </w:r>
       <w:proofErr w:type="spellStart"/>
       <w:r>
@@ -24614,7 +24508,7 @@
         </w:rPr>
       </w:pPr>
       <w:bookmarkStart w:id="48" w:name="_Toc208725411"/>
-      <w:bookmarkStart w:id="49" w:name="_Toc212741501"/>
+      <w:bookmarkStart w:id="49" w:name="_Toc238374778"/>
       <w:r>
         <w:rPr>
           <w:rStyle w:val="Enfasigrassetto"/>
@@ -24665,7 +24559,7 @@
         </w:rPr>
       </w:pPr>
       <w:bookmarkStart w:id="50" w:name="_Toc208725412"/>
-      <w:bookmarkStart w:id="51" w:name="_Toc212741502"/>
+      <w:bookmarkStart w:id="51" w:name="_Toc238374779"/>
       <w:r>
         <w:rPr>
           <w:rStyle w:val="Enfasigrassetto"/>
@@ -24711,7 +24605,7 @@
         </w:rPr>
       </w:pPr>
       <w:bookmarkStart w:id="52" w:name="_Toc208725413"/>
-      <w:bookmarkStart w:id="53" w:name="_Toc212741503"/>
+      <w:bookmarkStart w:id="53" w:name="_Toc238374780"/>
       <w:r>
         <w:rPr>
           <w:rStyle w:val="Enfasigrassetto"/>
@@ -24803,7 +24697,7 @@
         </w:rPr>
       </w:pPr>
       <w:bookmarkStart w:id="54" w:name="_Toc208725414"/>
-      <w:bookmarkStart w:id="55" w:name="_Toc212741504"/>
+      <w:bookmarkStart w:id="55" w:name="_Toc238374781"/>
       <w:r>
         <w:rPr>
           <w:rStyle w:val="Enfasigrassetto"/>
@@ -24853,15 +24747,7 @@
         <w:t xml:space="preserve">moves </w:t>
       </w:r>
       <w:r>
-        <w:t xml:space="preserve">the side mirrors to display the rear wheels when reverse gear and either the left or right turn signal are activated, </w:t>
-      </w:r>
-      <w:proofErr w:type="gramStart"/>
-      <w:r>
-        <w:t>in order to</w:t>
-      </w:r>
-      <w:proofErr w:type="gramEnd"/>
-      <w:r>
-        <w:t xml:space="preserve"> assist with parking near curbs.</w:t>
+        <w:t>the side mirrors to display the rear wheels when reverse gear and either the left or right turn signal are activated, in order to assist with parking near curbs.</w:t>
       </w:r>
     </w:p>
     <w:p>
@@ -25000,7 +24886,7 @@
         </w:rPr>
       </w:pPr>
       <w:bookmarkStart w:id="56" w:name="_Toc208725415"/>
-      <w:bookmarkStart w:id="57" w:name="_Toc212741505"/>
+      <w:bookmarkStart w:id="57" w:name="_Toc238374782"/>
       <w:r>
         <w:rPr>
           <w:rStyle w:val="Enfasigrassetto"/>
@@ -25063,15 +24949,7 @@
         <w:jc w:val="both"/>
       </w:pPr>
       <w:r>
-        <w:t>This function can be set, in SETUP MENU, as “ACC AUTOSTART R” or “ACC AUTOSTART +</w:t>
-      </w:r>
-      <w:proofErr w:type="gramStart"/>
-      <w:r>
-        <w:t>”,</w:t>
-      </w:r>
-      <w:proofErr w:type="gramEnd"/>
-      <w:r>
-        <w:t xml:space="preserve"> depending </w:t>
+        <w:t xml:space="preserve">This function can be set, in SETUP MENU, as “ACC AUTOSTART R” or “ACC AUTOSTART +”, depending </w:t>
       </w:r>
       <w:r>
         <w:t xml:space="preserve">on whether the vehicle in use allows restarting by pressing the RES button or the button to increase the Cruise Control speed. Once the function is activated, the </w:t>
@@ -25102,7 +24980,7 @@
         </w:rPr>
       </w:pPr>
       <w:bookmarkStart w:id="58" w:name="_Toc208725416"/>
-      <w:bookmarkStart w:id="59" w:name="_Toc212741506"/>
+      <w:bookmarkStart w:id="59" w:name="_Toc238374783"/>
       <w:r>
         <w:rPr>
           <w:rStyle w:val="Enfasigrassetto"/>
@@ -25399,7 +25277,7 @@
         </w:rPr>
       </w:pPr>
       <w:bookmarkStart w:id="60" w:name="_Toc208725417"/>
-      <w:bookmarkStart w:id="61" w:name="_Toc212741507"/>
+      <w:bookmarkStart w:id="61" w:name="_Toc238374784"/>
       <w:r>
         <w:rPr>
           <w:rStyle w:val="Enfasigrassetto"/>
@@ -25727,7 +25605,7 @@
         </w:rPr>
       </w:pPr>
       <w:bookmarkStart w:id="62" w:name="_Toc208725418"/>
-      <w:bookmarkStart w:id="63" w:name="_Toc212741508"/>
+      <w:bookmarkStart w:id="63" w:name="_Toc238374785"/>
       <w:r>
         <w:rPr>
           <w:rStyle w:val="Enfasigrassetto"/>
@@ -25880,7 +25758,7 @@
           <w:color w:val="auto"/>
         </w:rPr>
       </w:pPr>
-      <w:bookmarkStart w:id="64" w:name="_Toc212741509"/>
+      <w:bookmarkStart w:id="64" w:name="_Toc238374786"/>
       <w:r>
         <w:rPr>
           <w:rStyle w:val="Enfasigrassetto"/>

</xml_diff>